<commit_message>
report in progress CODE done
</commit_message>
<xml_diff>
--- a/assignment-3/Gabriel Martinez Report.docx
+++ b/assignment-3/Gabriel Martinez Report.docx
@@ -34,6 +34,3240 @@
         <w:t>Lab</w:t>
       </w:r>
     </w:p>
+    <w:p>
+      <w:r>
+        <w:t>The very first thing I did was get more information about SIMD</w:t>
+      </w:r>
+      <w:sdt>
+        <w:sdtPr>
+          <w:id w:val="-1766916923"/>
+          <w:citation/>
+        </w:sdtPr>
+        <w:sdtContent>
+          <w:r>
+            <w:fldChar w:fldCharType="begin"/>
+          </w:r>
+          <w:r>
+            <w:instrText xml:space="preserve"> CITATION Vic \l 1033 </w:instrText>
+          </w:r>
+          <w:r>
+            <w:fldChar w:fldCharType="separate"/>
+          </w:r>
+          <w:r>
+            <w:rPr>
+              <w:noProof/>
+            </w:rPr>
+            <w:t xml:space="preserve"> </w:t>
+          </w:r>
+          <w:r>
+            <w:rPr>
+              <w:noProof/>
+            </w:rPr>
+            <w:t>[1]</w:t>
+          </w:r>
+          <w:r>
+            <w:fldChar w:fldCharType="end"/>
+          </w:r>
+        </w:sdtContent>
+      </w:sdt>
+      <w:r>
+        <w:t xml:space="preserve">. Within the research phase I found a very good video that explained neon intrinsics </w:t>
+      </w:r>
+      <w:sdt>
+        <w:sdtPr>
+          <w:id w:val="-2113580401"/>
+          <w:citation/>
+        </w:sdtPr>
+        <w:sdtContent>
+          <w:r>
+            <w:fldChar w:fldCharType="begin"/>
+          </w:r>
+          <w:r>
+            <w:instrText xml:space="preserve"> CITATION ARM \l 1033 </w:instrText>
+          </w:r>
+          <w:r>
+            <w:fldChar w:fldCharType="separate"/>
+          </w:r>
+          <w:r>
+            <w:rPr>
+              <w:noProof/>
+            </w:rPr>
+            <w:t>[2]</w:t>
+          </w:r>
+          <w:r>
+            <w:fldChar w:fldCharType="end"/>
+          </w:r>
+        </w:sdtContent>
+      </w:sdt>
+      <w:r>
+        <w:t xml:space="preserve"> specifically helped me with understanding the naming convention of, e.g.,</w:t>
+      </w:r>
+      <w:r>
+        <w:t xml:space="preserve"> </w:t>
+      </w:r>
+      <w:r>
+        <w:rPr>
+          <w:rStyle w:val="Style1Char"/>
+          <w:sz w:val="24"/>
+          <w:szCs w:val="24"/>
+        </w:rPr>
+        <w:t>&lt;type&gt;&lt;size&gt;x&lt;#lanes&gt;_t</w:t>
+      </w:r>
+      <w:r>
+        <w:t xml:space="preserve">. </w:t>
+      </w:r>
+      <w:r>
+        <w:t xml:space="preserve">So, armed with this knowledge I was very quickly able to lookup the appropriate neon intrinsics functions and vector data type for the lab implementation </w:t>
+      </w:r>
+      <w:sdt>
+        <w:sdtPr>
+          <w:id w:val="368349535"/>
+          <w:citation/>
+        </w:sdtPr>
+        <w:sdtContent>
+          <w:r>
+            <w:fldChar w:fldCharType="begin"/>
+          </w:r>
+          <w:r>
+            <w:instrText xml:space="preserve"> CITATION ARM1 \l 1033 </w:instrText>
+          </w:r>
+          <w:r>
+            <w:fldChar w:fldCharType="separate"/>
+          </w:r>
+          <w:r>
+            <w:rPr>
+              <w:noProof/>
+            </w:rPr>
+            <w:t>[3]</w:t>
+          </w:r>
+          <w:r>
+            <w:fldChar w:fldCharType="end"/>
+          </w:r>
+        </w:sdtContent>
+      </w:sdt>
+      <w:r>
+        <w:t>.</w:t>
+      </w:r>
+    </w:p>
+    <w:p>
+      <w:pPr>
+        <w:pStyle w:val="ListParagraph"/>
+        <w:numPr>
+          <w:ilvl w:val="0"/>
+          <w:numId w:val="1"/>
+        </w:numPr>
+      </w:pPr>
+      <w:r>
+        <w:t xml:space="preserve">How do we handle when there </w:t>
+      </w:r>
+      <w:proofErr w:type="gramStart"/>
+      <w:r>
+        <w:t>is</w:t>
+      </w:r>
+      <w:proofErr w:type="gramEnd"/>
+      <w:r>
+        <w:t xml:space="preserve"> not at least four elements remaining? </w:t>
+      </w:r>
+    </w:p>
+    <w:p>
+      <w:pPr>
+        <w:pStyle w:val="ListParagraph"/>
+        <w:numPr>
+          <w:ilvl w:val="1"/>
+          <w:numId w:val="1"/>
+        </w:numPr>
+      </w:pPr>
+      <w:r>
+        <w:t>Answer: Keep track of the index and have a separate for loop to iterate through the remaining elements.</w:t>
+      </w:r>
+      <w:r>
+        <w:br/>
+      </w:r>
+      <w:r>
+        <w:rPr>
+          <w:noProof/>
+        </w:rPr>
+        <w:drawing>
+          <wp:inline distT="0" distB="0" distL="0" distR="0" wp14:anchorId="4A78C307" wp14:editId="6B3B72D2">
+            <wp:extent cx="3077017" cy="1852456"/>
+            <wp:effectExtent l="0" t="0" r="0" b="1905"/>
+            <wp:docPr id="988676125" name="Picture 1"/>
+            <wp:cNvGraphicFramePr>
+              <a:graphicFrameLocks xmlns:a="http://schemas.openxmlformats.org/drawingml/2006/main" noChangeAspect="1"/>
+            </wp:cNvGraphicFramePr>
+            <a:graphic xmlns:a="http://schemas.openxmlformats.org/drawingml/2006/main">
+              <a:graphicData uri="http://schemas.openxmlformats.org/drawingml/2006/picture">
+                <pic:pic xmlns:pic="http://schemas.openxmlformats.org/drawingml/2006/picture">
+                  <pic:nvPicPr>
+                    <pic:cNvPr id="988676125" name="Picture 988676125"/>
+                    <pic:cNvPicPr/>
+                  </pic:nvPicPr>
+                  <pic:blipFill>
+                    <a:blip r:embed="rId6" cstate="print">
+                      <a:extLst>
+                        <a:ext uri="{28A0092B-C50C-407E-A947-70E740481C1C}">
+                          <a14:useLocalDpi xmlns:a14="http://schemas.microsoft.com/office/drawing/2010/main" val="0"/>
+                        </a:ext>
+                      </a:extLst>
+                    </a:blip>
+                    <a:stretch>
+                      <a:fillRect/>
+                    </a:stretch>
+                  </pic:blipFill>
+                  <pic:spPr>
+                    <a:xfrm>
+                      <a:off x="0" y="0"/>
+                      <a:ext cx="3102866" cy="1868018"/>
+                    </a:xfrm>
+                    <a:prstGeom prst="rect">
+                      <a:avLst/>
+                    </a:prstGeom>
+                  </pic:spPr>
+                </pic:pic>
+              </a:graphicData>
+            </a:graphic>
+          </wp:inline>
+        </w:drawing>
+      </w:r>
+      <w:r>
+        <w:br/>
+      </w:r>
+    </w:p>
+    <w:p>
+      <w:pPr>
+        <w:pStyle w:val="ListParagraph"/>
+        <w:numPr>
+          <w:ilvl w:val="0"/>
+          <w:numId w:val="1"/>
+        </w:numPr>
+      </w:pPr>
+      <w:r>
+        <w:t xml:space="preserve">What is happening at the hardware level that may make this more efficient? </w:t>
+      </w:r>
+    </w:p>
+    <w:p>
+      <w:pPr>
+        <w:pStyle w:val="ListParagraph"/>
+        <w:numPr>
+          <w:ilvl w:val="1"/>
+          <w:numId w:val="1"/>
+        </w:numPr>
+      </w:pPr>
+      <w:r>
+        <w:t xml:space="preserve">Answer: </w:t>
+      </w:r>
+      <w:r>
+        <w:t>“</w:t>
+      </w:r>
+      <w:r>
+        <w:t>The NEON vector instruction set extensions for ARM provide Single Instruction Multiple Data (SIMD) capabilities that resemble the ones in the MMX and SSE vector instruction sets that are common to x86 and x64 architecture processors.</w:t>
+      </w:r>
+      <w:r>
+        <w:t>”</w:t>
+      </w:r>
+      <w:sdt>
+        <w:sdtPr>
+          <w:id w:val="1143931117"/>
+          <w:citation/>
+        </w:sdtPr>
+        <w:sdtContent>
+          <w:r>
+            <w:fldChar w:fldCharType="begin"/>
+          </w:r>
+          <w:r>
+            <w:instrText xml:space="preserve"> CITATION Mic \l 1033 </w:instrText>
+          </w:r>
+          <w:r>
+            <w:fldChar w:fldCharType="separate"/>
+          </w:r>
+          <w:r>
+            <w:rPr>
+              <w:noProof/>
+            </w:rPr>
+            <w:t xml:space="preserve"> </w:t>
+          </w:r>
+          <w:r>
+            <w:rPr>
+              <w:noProof/>
+            </w:rPr>
+            <w:t>[4]</w:t>
+          </w:r>
+          <w:r>
+            <w:fldChar w:fldCharType="end"/>
+          </w:r>
+        </w:sdtContent>
+      </w:sdt>
+      <w:r>
+        <w:t>.</w:t>
+      </w:r>
+      <w:r>
+        <w:t xml:space="preserve"> </w:t>
+      </w:r>
+      <w:r>
+        <w:t>At the hardware level, NEON allows the CPU to process four integers at once instead of one at a time. This reduces the number of instructions and may make the program faster</w:t>
+      </w:r>
+      <w:r>
+        <w:t xml:space="preserve"> by enabling data level parallelism.</w:t>
+      </w:r>
+    </w:p>
+    <w:p>
+      <w:pPr>
+        <w:pStyle w:val="Heading2"/>
+      </w:pPr>
+    </w:p>
+    <w:p>
+      <w:pPr>
+        <w:pStyle w:val="NoSpacing"/>
+      </w:pPr>
+      <w:r>
+        <w:t>Lab Output</w:t>
+      </w:r>
+      <w:r>
+        <w:rPr>
+          <w:noProof/>
+        </w:rPr>
+        <w:drawing>
+          <wp:inline distT="0" distB="0" distL="0" distR="0" wp14:anchorId="0EF77ADD" wp14:editId="336363D4">
+            <wp:extent cx="6284890" cy="3498321"/>
+            <wp:effectExtent l="0" t="0" r="1905" b="0"/>
+            <wp:docPr id="1815639008" name="Picture 2"/>
+            <wp:cNvGraphicFramePr>
+              <a:graphicFrameLocks xmlns:a="http://schemas.openxmlformats.org/drawingml/2006/main" noChangeAspect="1"/>
+            </wp:cNvGraphicFramePr>
+            <a:graphic xmlns:a="http://schemas.openxmlformats.org/drawingml/2006/main">
+              <a:graphicData uri="http://schemas.openxmlformats.org/drawingml/2006/picture">
+                <pic:pic xmlns:pic="http://schemas.openxmlformats.org/drawingml/2006/picture">
+                  <pic:nvPicPr>
+                    <pic:cNvPr id="1815639008" name="Picture 1815639008"/>
+                    <pic:cNvPicPr/>
+                  </pic:nvPicPr>
+                  <pic:blipFill>
+                    <a:blip r:embed="rId7">
+                      <a:extLst>
+                        <a:ext uri="{28A0092B-C50C-407E-A947-70E740481C1C}">
+                          <a14:useLocalDpi xmlns:a14="http://schemas.microsoft.com/office/drawing/2010/main" val="0"/>
+                        </a:ext>
+                      </a:extLst>
+                    </a:blip>
+                    <a:stretch>
+                      <a:fillRect/>
+                    </a:stretch>
+                  </pic:blipFill>
+                  <pic:spPr>
+                    <a:xfrm>
+                      <a:off x="0" y="0"/>
+                      <a:ext cx="6375020" cy="3548490"/>
+                    </a:xfrm>
+                    <a:prstGeom prst="rect">
+                      <a:avLst/>
+                    </a:prstGeom>
+                  </pic:spPr>
+                </pic:pic>
+              </a:graphicData>
+            </a:graphic>
+          </wp:inline>
+        </w:drawing>
+      </w:r>
+    </w:p>
+    <w:p>
+      <w:pPr>
+        <w:pStyle w:val="Heading2"/>
+      </w:pPr>
+      <w:r>
+        <w:t>Assignment 3 Report</w:t>
+      </w:r>
+    </w:p>
+    <w:p>
+      <w:pPr>
+        <w:pStyle w:val="Heading3"/>
+      </w:pPr>
+      <w:r>
+        <w:t xml:space="preserve">3.1 </w:t>
+      </w:r>
+      <w:r>
+        <w:t xml:space="preserve">OpenCL </w:t>
+      </w:r>
+      <w:r>
+        <w:t>Naïve Matrix Multiply</w:t>
+      </w:r>
+    </w:p>
+    <w:p>
+      <w:pPr>
+        <w:shd w:val="clear" w:color="auto" w:fill="121314"/>
+        <w:spacing w:after="0" w:line="270" w:lineRule="atLeast"/>
+        <w:rPr>
+          <w:rFonts w:ascii="Menlo" w:eastAsia="Times New Roman" w:hAnsi="Menlo" w:cs="Menlo"/>
+          <w:color w:val="BBBEBF"/>
+          <w:kern w:val="0"/>
+          <w:sz w:val="18"/>
+          <w:szCs w:val="18"/>
+          <w14:ligatures w14:val="none"/>
+        </w:rPr>
+      </w:pPr>
+      <w:r>
+        <w:rPr>
+          <w:rFonts w:ascii="Menlo" w:eastAsia="Times New Roman" w:hAnsi="Menlo" w:cs="Menlo"/>
+          <w:color w:val="FFA657"/>
+          <w:kern w:val="0"/>
+          <w:sz w:val="18"/>
+          <w:szCs w:val="18"/>
+          <w14:ligatures w14:val="none"/>
+        </w:rPr>
+        <w:t>*</w:t>
+      </w:r>
+      <w:r>
+        <w:rPr>
+          <w:rFonts w:ascii="Menlo" w:eastAsia="Times New Roman" w:hAnsi="Menlo" w:cs="Menlo"/>
+          <w:color w:val="BBBEBF"/>
+          <w:kern w:val="0"/>
+          <w:sz w:val="18"/>
+          <w:szCs w:val="18"/>
+          <w14:ligatures w14:val="none"/>
+        </w:rPr>
+        <w:t xml:space="preserve"> Please use the </w:t>
+      </w:r>
+      <w:r>
+        <w:rPr>
+          <w:rFonts w:ascii="Menlo" w:eastAsia="Times New Roman" w:hAnsi="Menlo" w:cs="Menlo"/>
+          <w:color w:val="79C0FF"/>
+          <w:kern w:val="0"/>
+          <w:sz w:val="18"/>
+          <w:szCs w:val="18"/>
+          <w14:ligatures w14:val="none"/>
+        </w:rPr>
+        <w:t>`time`</w:t>
+      </w:r>
+      <w:r>
+        <w:rPr>
+          <w:rFonts w:ascii="Menlo" w:eastAsia="Times New Roman" w:hAnsi="Menlo" w:cs="Menlo"/>
+          <w:color w:val="BBBEBF"/>
+          <w:kern w:val="0"/>
+          <w:sz w:val="18"/>
+          <w:szCs w:val="18"/>
+          <w14:ligatures w14:val="none"/>
+        </w:rPr>
+        <w:t xml:space="preserve"> command to compare this against your implementations in Assignment 2.  Is this faster for all </w:t>
+      </w:r>
+      <w:proofErr w:type="spellStart"/>
+      <w:r>
+        <w:rPr>
+          <w:rFonts w:ascii="Menlo" w:eastAsia="Times New Roman" w:hAnsi="Menlo" w:cs="Menlo"/>
+          <w:color w:val="BBBEBF"/>
+          <w:kern w:val="0"/>
+          <w:sz w:val="18"/>
+          <w:szCs w:val="18"/>
+          <w14:ligatures w14:val="none"/>
+        </w:rPr>
+        <w:t>matricies</w:t>
+      </w:r>
+      <w:proofErr w:type="spellEnd"/>
+      <w:r>
+        <w:rPr>
+          <w:rFonts w:ascii="Menlo" w:eastAsia="Times New Roman" w:hAnsi="Menlo" w:cs="Menlo"/>
+          <w:color w:val="BBBEBF"/>
+          <w:kern w:val="0"/>
+          <w:sz w:val="18"/>
+          <w:szCs w:val="18"/>
+          <w14:ligatures w14:val="none"/>
+        </w:rPr>
+        <w:t>?  If not, why?</w:t>
+      </w:r>
+    </w:p>
+    <w:p>
+      <w:pPr>
+        <w:shd w:val="clear" w:color="auto" w:fill="121314"/>
+        <w:spacing w:after="0" w:line="270" w:lineRule="atLeast"/>
+        <w:rPr>
+          <w:rFonts w:ascii="Menlo" w:eastAsia="Times New Roman" w:hAnsi="Menlo" w:cs="Menlo"/>
+          <w:color w:val="BBBEBF"/>
+          <w:kern w:val="0"/>
+          <w:sz w:val="18"/>
+          <w:szCs w:val="18"/>
+          <w14:ligatures w14:val="none"/>
+        </w:rPr>
+      </w:pPr>
+      <w:r>
+        <w:rPr>
+          <w:rFonts w:ascii="Menlo" w:eastAsia="Times New Roman" w:hAnsi="Menlo" w:cs="Menlo"/>
+          <w:color w:val="BBBEBF"/>
+          <w:kern w:val="0"/>
+          <w:sz w:val="18"/>
+          <w:szCs w:val="18"/>
+          <w14:ligatures w14:val="none"/>
+        </w:rPr>
+        <w:t xml:space="preserve">Answer: No. Below will show some time </w:t>
+      </w:r>
+      <w:proofErr w:type="gramStart"/>
+      <w:r>
+        <w:rPr>
+          <w:rFonts w:ascii="Menlo" w:eastAsia="Times New Roman" w:hAnsi="Menlo" w:cs="Menlo"/>
+          <w:color w:val="BBBEBF"/>
+          <w:kern w:val="0"/>
+          <w:sz w:val="18"/>
+          <w:szCs w:val="18"/>
+          <w14:ligatures w14:val="none"/>
+        </w:rPr>
+        <w:t>outputs</w:t>
+      </w:r>
+      <w:proofErr w:type="gramEnd"/>
+      <w:r>
+        <w:rPr>
+          <w:rFonts w:ascii="Menlo" w:eastAsia="Times New Roman" w:hAnsi="Menlo" w:cs="Menlo"/>
+          <w:color w:val="BBBEBF"/>
+          <w:kern w:val="0"/>
+          <w:sz w:val="18"/>
+          <w:szCs w:val="18"/>
+          <w14:ligatures w14:val="none"/>
+        </w:rPr>
+        <w:t xml:space="preserve"> but the takeaway is the </w:t>
+      </w:r>
+      <w:proofErr w:type="spellStart"/>
+      <w:r>
+        <w:rPr>
+          <w:rFonts w:ascii="Menlo" w:eastAsia="Times New Roman" w:hAnsi="Menlo" w:cs="Menlo"/>
+          <w:color w:val="BBBEBF"/>
+          <w:kern w:val="0"/>
+          <w:sz w:val="18"/>
+          <w:szCs w:val="18"/>
+          <w14:ligatures w14:val="none"/>
+        </w:rPr>
+        <w:t>opencl</w:t>
+      </w:r>
+      <w:proofErr w:type="spellEnd"/>
+      <w:r>
+        <w:rPr>
+          <w:rFonts w:ascii="Menlo" w:eastAsia="Times New Roman" w:hAnsi="Menlo" w:cs="Menlo"/>
+          <w:color w:val="BBBEBF"/>
+          <w:kern w:val="0"/>
+          <w:sz w:val="18"/>
+          <w:szCs w:val="18"/>
+          <w14:ligatures w14:val="none"/>
+        </w:rPr>
+        <w:t xml:space="preserve"> is faster overall but for smaller datasets, e.g. dataset0,</w:t>
+      </w:r>
+      <w:r>
+        <w:rPr>
+          <w:rFonts w:ascii="Menlo" w:eastAsia="Times New Roman" w:hAnsi="Menlo" w:cs="Menlo"/>
+          <w:color w:val="BBBEBF"/>
+          <w:kern w:val="0"/>
+          <w:sz w:val="18"/>
+          <w:szCs w:val="18"/>
+          <w14:ligatures w14:val="none"/>
+        </w:rPr>
+        <w:t xml:space="preserve"> it is slower since there is more overhead and latency to transfer from host to </w:t>
+      </w:r>
+      <w:proofErr w:type="spellStart"/>
+      <w:r>
+        <w:rPr>
+          <w:rFonts w:ascii="Menlo" w:eastAsia="Times New Roman" w:hAnsi="Menlo" w:cs="Menlo"/>
+          <w:color w:val="BBBEBF"/>
+          <w:kern w:val="0"/>
+          <w:sz w:val="18"/>
+          <w:szCs w:val="18"/>
+          <w14:ligatures w14:val="none"/>
+        </w:rPr>
+        <w:t>gpu</w:t>
+      </w:r>
+      <w:proofErr w:type="spellEnd"/>
+      <w:r>
+        <w:rPr>
+          <w:rFonts w:ascii="Menlo" w:eastAsia="Times New Roman" w:hAnsi="Menlo" w:cs="Menlo"/>
+          <w:color w:val="BBBEBF"/>
+          <w:kern w:val="0"/>
+          <w:sz w:val="18"/>
+          <w:szCs w:val="18"/>
+          <w14:ligatures w14:val="none"/>
+        </w:rPr>
+        <w:t xml:space="preserve"> and </w:t>
+      </w:r>
+      <w:proofErr w:type="spellStart"/>
+      <w:r>
+        <w:rPr>
+          <w:rFonts w:ascii="Menlo" w:eastAsia="Times New Roman" w:hAnsi="Menlo" w:cs="Menlo"/>
+          <w:color w:val="BBBEBF"/>
+          <w:kern w:val="0"/>
+          <w:sz w:val="18"/>
+          <w:szCs w:val="18"/>
+          <w14:ligatures w14:val="none"/>
+        </w:rPr>
+        <w:t>gpu</w:t>
+      </w:r>
+      <w:proofErr w:type="spellEnd"/>
+      <w:r>
+        <w:rPr>
+          <w:rFonts w:ascii="Menlo" w:eastAsia="Times New Roman" w:hAnsi="Menlo" w:cs="Menlo"/>
+          <w:color w:val="BBBEBF"/>
+          <w:kern w:val="0"/>
+          <w:sz w:val="18"/>
+          <w:szCs w:val="18"/>
+          <w14:ligatures w14:val="none"/>
+        </w:rPr>
+        <w:t xml:space="preserve"> back to host.</w:t>
+      </w:r>
+    </w:p>
+    <w:p>
+      <w:pPr>
+        <w:shd w:val="clear" w:color="auto" w:fill="121314"/>
+        <w:spacing w:after="0" w:line="270" w:lineRule="atLeast"/>
+        <w:rPr>
+          <w:rFonts w:ascii="Menlo" w:eastAsia="Times New Roman" w:hAnsi="Menlo" w:cs="Menlo"/>
+          <w:color w:val="BBBEBF"/>
+          <w:kern w:val="0"/>
+          <w:sz w:val="18"/>
+          <w:szCs w:val="18"/>
+          <w14:ligatures w14:val="none"/>
+        </w:rPr>
+      </w:pPr>
+    </w:p>
+    <w:p>
+      <w:pPr>
+        <w:shd w:val="clear" w:color="auto" w:fill="121314"/>
+        <w:spacing w:after="0" w:line="270" w:lineRule="atLeast"/>
+        <w:rPr>
+          <w:rFonts w:ascii="Menlo" w:eastAsia="Times New Roman" w:hAnsi="Menlo" w:cs="Menlo"/>
+          <w:color w:val="BBBEBF"/>
+          <w:kern w:val="0"/>
+          <w:sz w:val="18"/>
+          <w:szCs w:val="18"/>
+          <w14:ligatures w14:val="none"/>
+        </w:rPr>
+      </w:pPr>
+      <w:r>
+        <w:rPr>
+          <w:rFonts w:ascii="Menlo" w:eastAsia="Times New Roman" w:hAnsi="Menlo" w:cs="Menlo"/>
+          <w:color w:val="FFA657"/>
+          <w:kern w:val="0"/>
+          <w:sz w:val="18"/>
+          <w:szCs w:val="18"/>
+          <w14:ligatures w14:val="none"/>
+        </w:rPr>
+        <w:t>*</w:t>
+      </w:r>
+      <w:r>
+        <w:rPr>
+          <w:rFonts w:ascii="Menlo" w:eastAsia="Times New Roman" w:hAnsi="Menlo" w:cs="Menlo"/>
+          <w:color w:val="BBBEBF"/>
+          <w:kern w:val="0"/>
+          <w:sz w:val="18"/>
+          <w:szCs w:val="18"/>
+          <w14:ligatures w14:val="none"/>
+        </w:rPr>
+        <w:t xml:space="preserve"> Talk about latency of this method vs neon vs plain CPU.  Are there times where you might want to use different methods?</w:t>
+      </w:r>
+    </w:p>
+    <w:p/>
+    <w:p>
+      <w:pPr>
+        <w:spacing w:before="100" w:beforeAutospacing="1" w:after="100" w:afterAutospacing="1" w:line="240" w:lineRule="auto"/>
+        <w:rPr>
+          <w:rFonts w:eastAsia="Times New Roman" w:cs="Times New Roman"/>
+          <w:kern w:val="0"/>
+          <w14:ligatures w14:val="none"/>
+        </w:rPr>
+      </w:pPr>
+      <w:r>
+        <w:rPr>
+          <w:rFonts w:eastAsia="Times New Roman" w:cs="Times New Roman"/>
+          <w:kern w:val="0"/>
+          <w14:ligatures w14:val="none"/>
+        </w:rPr>
+        <w:t xml:space="preserve">Running </w:t>
+      </w:r>
+      <w:r>
+        <w:rPr>
+          <w:rFonts w:eastAsia="Times New Roman" w:cs="Times New Roman"/>
+          <w:kern w:val="0"/>
+          <w14:ligatures w14:val="none"/>
+        </w:rPr>
+        <w:t>`</w:t>
+      </w:r>
+      <w:r>
+        <w:rPr>
+          <w:rFonts w:eastAsia="Times New Roman" w:cs="Courier New"/>
+          <w:kern w:val="0"/>
+          <w14:ligatures w14:val="none"/>
+        </w:rPr>
+        <w:t>time make run</w:t>
+      </w:r>
+      <w:r>
+        <w:rPr>
+          <w:rFonts w:eastAsia="Times New Roman" w:cs="Times New Roman"/>
+          <w:kern w:val="0"/>
+          <w14:ligatures w14:val="none"/>
+        </w:rPr>
+        <w:t>`</w:t>
+      </w:r>
+      <w:r>
+        <w:rPr>
+          <w:rFonts w:eastAsia="Times New Roman" w:cs="Times New Roman"/>
+          <w:kern w:val="0"/>
+          <w14:ligatures w14:val="none"/>
+        </w:rPr>
+        <w:t xml:space="preserve"> </w:t>
+      </w:r>
+      <w:r>
+        <w:rPr>
+          <w:rFonts w:eastAsia="Times New Roman" w:cs="Times New Roman"/>
+          <w:kern w:val="0"/>
+          <w14:ligatures w14:val="none"/>
+        </w:rPr>
+        <w:t>produced the following results:</w:t>
+      </w:r>
+    </w:p>
+    <w:tbl>
+      <w:tblPr>
+        <w:tblW w:w="9320" w:type="dxa"/>
+        <w:tblCellSpacing w:w="15" w:type="dxa"/>
+        <w:tblCellMar>
+          <w:top w:w="15" w:type="dxa"/>
+          <w:left w:w="15" w:type="dxa"/>
+          <w:bottom w:w="15" w:type="dxa"/>
+          <w:right w:w="15" w:type="dxa"/>
+        </w:tblCellMar>
+        <w:tblLook w:val="04A0" w:firstRow="1" w:lastRow="0" w:firstColumn="1" w:lastColumn="0" w:noHBand="0" w:noVBand="1"/>
+      </w:tblPr>
+      <w:tblGrid>
+        <w:gridCol w:w="3000"/>
+        <w:gridCol w:w="2580"/>
+        <w:gridCol w:w="2160"/>
+        <w:gridCol w:w="1580"/>
+      </w:tblGrid>
+      <w:tr>
+        <w:trPr>
+          <w:trHeight w:val="353"/>
+          <w:tblCellSpacing w:w="15" w:type="dxa"/>
+        </w:trPr>
+        <w:tc>
+          <w:tcPr>
+            <w:tcW w:w="0" w:type="auto"/>
+            <w:vAlign w:val="center"/>
+            <w:hideMark/>
+          </w:tcPr>
+          <w:p>
+            <w:pPr>
+              <w:spacing w:after="0" w:line="240" w:lineRule="auto"/>
+              <w:rPr>
+                <w:rFonts w:eastAsia="Times New Roman" w:cs="Times New Roman"/>
+                <w:b/>
+                <w:bCs/>
+                <w:kern w:val="0"/>
+                <w14:ligatures w14:val="none"/>
+              </w:rPr>
+            </w:pPr>
+            <w:r>
+              <w:rPr>
+                <w:rFonts w:eastAsia="Times New Roman" w:cs="Times New Roman"/>
+                <w:b/>
+                <w:bCs/>
+                <w:kern w:val="0"/>
+                <w14:ligatures w14:val="none"/>
+              </w:rPr>
+              <w:t>Measurement</w:t>
+            </w:r>
+          </w:p>
+        </w:tc>
+        <w:tc>
+          <w:tcPr>
+            <w:tcW w:w="2550" w:type="dxa"/>
+            <w:vAlign w:val="center"/>
+            <w:hideMark/>
+          </w:tcPr>
+          <w:p>
+            <w:pPr>
+              <w:spacing w:after="0" w:line="240" w:lineRule="auto"/>
+              <w:rPr>
+                <w:rFonts w:eastAsia="Times New Roman" w:cs="Times New Roman"/>
+                <w:b/>
+                <w:bCs/>
+                <w:kern w:val="0"/>
+                <w14:ligatures w14:val="none"/>
+              </w:rPr>
+            </w:pPr>
+            <w:r>
+              <w:rPr>
+                <w:rFonts w:eastAsia="Times New Roman" w:cs="Times New Roman"/>
+                <w:b/>
+                <w:bCs/>
+                <w:kern w:val="0"/>
+                <w14:ligatures w14:val="none"/>
+              </w:rPr>
+              <w:t>Assignment #2</w:t>
+            </w:r>
+          </w:p>
+        </w:tc>
+        <w:tc>
+          <w:tcPr>
+            <w:tcW w:w="2130" w:type="dxa"/>
+            <w:vAlign w:val="center"/>
+            <w:hideMark/>
+          </w:tcPr>
+          <w:p>
+            <w:pPr>
+              <w:spacing w:after="0" w:line="240" w:lineRule="auto"/>
+              <w:rPr>
+                <w:rFonts w:eastAsia="Times New Roman" w:cs="Times New Roman"/>
+                <w:b/>
+                <w:bCs/>
+                <w:kern w:val="0"/>
+                <w14:ligatures w14:val="none"/>
+              </w:rPr>
+            </w:pPr>
+            <w:r>
+              <w:rPr>
+                <w:rFonts w:eastAsia="Times New Roman" w:cs="Times New Roman"/>
+                <w:b/>
+                <w:bCs/>
+                <w:kern w:val="0"/>
+                <w14:ligatures w14:val="none"/>
+              </w:rPr>
+              <w:t>Assignment #3</w:t>
+            </w:r>
+          </w:p>
+        </w:tc>
+        <w:tc>
+          <w:tcPr>
+            <w:tcW w:w="1535" w:type="dxa"/>
+          </w:tcPr>
+          <w:p>
+            <w:pPr>
+              <w:spacing w:after="0" w:line="240" w:lineRule="auto"/>
+              <w:rPr>
+                <w:rFonts w:eastAsia="Times New Roman" w:cs="Times New Roman"/>
+                <w:b/>
+                <w:bCs/>
+                <w:kern w:val="0"/>
+                <w14:ligatures w14:val="none"/>
+              </w:rPr>
+            </w:pPr>
+            <w:r>
+              <w:rPr>
+                <w:rFonts w:eastAsia="Times New Roman" w:cs="Times New Roman"/>
+                <w:b/>
+                <w:bCs/>
+                <w:kern w:val="0"/>
+                <w14:ligatures w14:val="none"/>
+              </w:rPr>
+              <w:t>Speedup (x)</w:t>
+            </w:r>
+          </w:p>
+        </w:tc>
+      </w:tr>
+      <w:tr>
+        <w:trPr>
+          <w:trHeight w:val="319"/>
+          <w:tblCellSpacing w:w="15" w:type="dxa"/>
+        </w:trPr>
+        <w:tc>
+          <w:tcPr>
+            <w:tcW w:w="0" w:type="auto"/>
+            <w:vAlign w:val="center"/>
+            <w:hideMark/>
+          </w:tcPr>
+          <w:p>
+            <w:pPr>
+              <w:spacing w:after="0" w:line="240" w:lineRule="auto"/>
+              <w:rPr>
+                <w:rFonts w:eastAsia="Times New Roman" w:cs="Times New Roman"/>
+                <w:kern w:val="0"/>
+                <w14:ligatures w14:val="none"/>
+              </w:rPr>
+            </w:pPr>
+            <w:r>
+              <w:rPr>
+                <w:rFonts w:eastAsia="Times New Roman" w:cs="Times New Roman"/>
+                <w:kern w:val="0"/>
+                <w14:ligatures w14:val="none"/>
+              </w:rPr>
+              <w:t>Real time</w:t>
+            </w:r>
+          </w:p>
+        </w:tc>
+        <w:tc>
+          <w:tcPr>
+            <w:tcW w:w="2550" w:type="dxa"/>
+            <w:vAlign w:val="center"/>
+            <w:hideMark/>
+          </w:tcPr>
+          <w:p>
+            <w:pPr>
+              <w:spacing w:after="0" w:line="240" w:lineRule="auto"/>
+              <w:rPr>
+                <w:rFonts w:eastAsia="Times New Roman" w:cs="Times New Roman"/>
+                <w:kern w:val="0"/>
+                <w14:ligatures w14:val="none"/>
+              </w:rPr>
+            </w:pPr>
+            <w:r>
+              <w:rPr>
+                <w:rFonts w:eastAsia="Times New Roman" w:cs="Times New Roman"/>
+                <w:kern w:val="0"/>
+                <w14:ligatures w14:val="none"/>
+              </w:rPr>
+              <w:t>2m 55.721s</w:t>
+            </w:r>
+          </w:p>
+        </w:tc>
+        <w:tc>
+          <w:tcPr>
+            <w:tcW w:w="2130" w:type="dxa"/>
+            <w:vAlign w:val="center"/>
+            <w:hideMark/>
+          </w:tcPr>
+          <w:p>
+            <w:pPr>
+              <w:spacing w:after="0" w:line="240" w:lineRule="auto"/>
+              <w:rPr>
+                <w:rFonts w:eastAsia="Times New Roman" w:cs="Times New Roman"/>
+                <w:kern w:val="0"/>
+                <w14:ligatures w14:val="none"/>
+              </w:rPr>
+            </w:pPr>
+            <w:r>
+              <w:rPr>
+                <w:rFonts w:eastAsia="Times New Roman" w:cs="Times New Roman"/>
+                <w:kern w:val="0"/>
+                <w14:ligatures w14:val="none"/>
+              </w:rPr>
+              <w:t>0m 50.718s</w:t>
+            </w:r>
+          </w:p>
+        </w:tc>
+        <w:tc>
+          <w:tcPr>
+            <w:tcW w:w="1535" w:type="dxa"/>
+          </w:tcPr>
+          <w:p>
+            <w:pPr>
+              <w:spacing w:after="0" w:line="240" w:lineRule="auto"/>
+              <w:rPr>
+                <w:rFonts w:eastAsia="Times New Roman" w:cs="Times New Roman"/>
+                <w:kern w:val="0"/>
+                <w14:ligatures w14:val="none"/>
+              </w:rPr>
+            </w:pPr>
+            <w:r>
+              <w:rPr>
+                <w:rFonts w:eastAsia="Times New Roman" w:cs="Times New Roman"/>
+                <w:kern w:val="0"/>
+                <w14:ligatures w14:val="none"/>
+              </w:rPr>
+              <w:t>3.46x</w:t>
+            </w:r>
+          </w:p>
+        </w:tc>
+      </w:tr>
+      <w:tr>
+        <w:trPr>
+          <w:trHeight w:val="298"/>
+          <w:tblCellSpacing w:w="15" w:type="dxa"/>
+        </w:trPr>
+        <w:tc>
+          <w:tcPr>
+            <w:tcW w:w="0" w:type="auto"/>
+            <w:vAlign w:val="center"/>
+            <w:hideMark/>
+          </w:tcPr>
+          <w:p>
+            <w:pPr>
+              <w:spacing w:after="0" w:line="240" w:lineRule="auto"/>
+              <w:rPr>
+                <w:rFonts w:eastAsia="Times New Roman" w:cs="Times New Roman"/>
+                <w:kern w:val="0"/>
+                <w14:ligatures w14:val="none"/>
+              </w:rPr>
+            </w:pPr>
+            <w:r>
+              <w:rPr>
+                <w:rFonts w:eastAsia="Times New Roman" w:cs="Times New Roman"/>
+                <w:kern w:val="0"/>
+                <w14:ligatures w14:val="none"/>
+              </w:rPr>
+              <w:t>User time</w:t>
+            </w:r>
+          </w:p>
+        </w:tc>
+        <w:tc>
+          <w:tcPr>
+            <w:tcW w:w="2550" w:type="dxa"/>
+            <w:vAlign w:val="center"/>
+            <w:hideMark/>
+          </w:tcPr>
+          <w:p>
+            <w:pPr>
+              <w:spacing w:after="0" w:line="240" w:lineRule="auto"/>
+              <w:rPr>
+                <w:rFonts w:eastAsia="Times New Roman" w:cs="Times New Roman"/>
+                <w:kern w:val="0"/>
+                <w14:ligatures w14:val="none"/>
+              </w:rPr>
+            </w:pPr>
+            <w:r>
+              <w:rPr>
+                <w:rFonts w:eastAsia="Times New Roman" w:cs="Times New Roman"/>
+                <w:kern w:val="0"/>
+                <w14:ligatures w14:val="none"/>
+              </w:rPr>
+              <w:t>2m 54.587s</w:t>
+            </w:r>
+          </w:p>
+        </w:tc>
+        <w:tc>
+          <w:tcPr>
+            <w:tcW w:w="2130" w:type="dxa"/>
+            <w:vAlign w:val="center"/>
+            <w:hideMark/>
+          </w:tcPr>
+          <w:p>
+            <w:pPr>
+              <w:spacing w:after="0" w:line="240" w:lineRule="auto"/>
+              <w:rPr>
+                <w:rFonts w:eastAsia="Times New Roman" w:cs="Times New Roman"/>
+                <w:kern w:val="0"/>
+                <w14:ligatures w14:val="none"/>
+              </w:rPr>
+            </w:pPr>
+            <w:r>
+              <w:rPr>
+                <w:rFonts w:eastAsia="Times New Roman" w:cs="Times New Roman"/>
+                <w:kern w:val="0"/>
+                <w14:ligatures w14:val="none"/>
+              </w:rPr>
+              <w:t>0m 2.154s</w:t>
+            </w:r>
+          </w:p>
+        </w:tc>
+        <w:tc>
+          <w:tcPr>
+            <w:tcW w:w="1535" w:type="dxa"/>
+          </w:tcPr>
+          <w:p>
+            <w:pPr>
+              <w:spacing w:after="0" w:line="240" w:lineRule="auto"/>
+              <w:rPr>
+                <w:rFonts w:eastAsia="Times New Roman" w:cs="Times New Roman"/>
+                <w:kern w:val="0"/>
+                <w14:ligatures w14:val="none"/>
+              </w:rPr>
+            </w:pPr>
+          </w:p>
+        </w:tc>
+      </w:tr>
+      <w:tr>
+        <w:trPr>
+          <w:trHeight w:val="298"/>
+          <w:tblCellSpacing w:w="15" w:type="dxa"/>
+        </w:trPr>
+        <w:tc>
+          <w:tcPr>
+            <w:tcW w:w="0" w:type="auto"/>
+            <w:vAlign w:val="center"/>
+            <w:hideMark/>
+          </w:tcPr>
+          <w:p>
+            <w:pPr>
+              <w:spacing w:after="0" w:line="240" w:lineRule="auto"/>
+              <w:rPr>
+                <w:rFonts w:eastAsia="Times New Roman" w:cs="Times New Roman"/>
+                <w:kern w:val="0"/>
+                <w14:ligatures w14:val="none"/>
+              </w:rPr>
+            </w:pPr>
+            <w:r>
+              <w:rPr>
+                <w:rFonts w:eastAsia="Times New Roman" w:cs="Times New Roman"/>
+                <w:kern w:val="0"/>
+                <w14:ligatures w14:val="none"/>
+              </w:rPr>
+              <w:t>System time</w:t>
+            </w:r>
+          </w:p>
+        </w:tc>
+        <w:tc>
+          <w:tcPr>
+            <w:tcW w:w="2550" w:type="dxa"/>
+            <w:vAlign w:val="center"/>
+            <w:hideMark/>
+          </w:tcPr>
+          <w:p>
+            <w:pPr>
+              <w:spacing w:after="0" w:line="240" w:lineRule="auto"/>
+              <w:rPr>
+                <w:rFonts w:eastAsia="Times New Roman" w:cs="Times New Roman"/>
+                <w:kern w:val="0"/>
+                <w14:ligatures w14:val="none"/>
+              </w:rPr>
+            </w:pPr>
+            <w:r>
+              <w:rPr>
+                <w:rFonts w:eastAsia="Times New Roman" w:cs="Times New Roman"/>
+                <w:kern w:val="0"/>
+                <w14:ligatures w14:val="none"/>
+              </w:rPr>
+              <w:t>0m 0.254s</w:t>
+            </w:r>
+          </w:p>
+        </w:tc>
+        <w:tc>
+          <w:tcPr>
+            <w:tcW w:w="2130" w:type="dxa"/>
+            <w:vAlign w:val="center"/>
+            <w:hideMark/>
+          </w:tcPr>
+          <w:p>
+            <w:pPr>
+              <w:spacing w:after="0" w:line="240" w:lineRule="auto"/>
+              <w:rPr>
+                <w:rFonts w:eastAsia="Times New Roman" w:cs="Times New Roman"/>
+                <w:kern w:val="0"/>
+                <w14:ligatures w14:val="none"/>
+              </w:rPr>
+            </w:pPr>
+            <w:r>
+              <w:rPr>
+                <w:rFonts w:eastAsia="Times New Roman" w:cs="Times New Roman"/>
+                <w:kern w:val="0"/>
+                <w14:ligatures w14:val="none"/>
+              </w:rPr>
+              <w:t>0m 0.755s</w:t>
+            </w:r>
+          </w:p>
+        </w:tc>
+        <w:tc>
+          <w:tcPr>
+            <w:tcW w:w="1535" w:type="dxa"/>
+          </w:tcPr>
+          <w:p>
+            <w:pPr>
+              <w:spacing w:after="0" w:line="240" w:lineRule="auto"/>
+              <w:rPr>
+                <w:rFonts w:eastAsia="Times New Roman" w:cs="Times New Roman"/>
+                <w:kern w:val="0"/>
+                <w14:ligatures w14:val="none"/>
+              </w:rPr>
+            </w:pPr>
+          </w:p>
+        </w:tc>
+      </w:tr>
+    </w:tbl>
+    <w:p>
+      <w:pPr>
+        <w:spacing w:before="100" w:beforeAutospacing="1" w:after="100" w:afterAutospacing="1" w:line="240" w:lineRule="auto"/>
+        <w:rPr>
+          <w:rFonts w:eastAsia="Times New Roman" w:cs="Times New Roman"/>
+          <w:kern w:val="0"/>
+          <w14:ligatures w14:val="none"/>
+        </w:rPr>
+      </w:pPr>
+      <w:r>
+        <w:rPr>
+          <w:rFonts w:eastAsia="Times New Roman" w:cs="Times New Roman"/>
+          <w:kern w:val="0"/>
+          <w14:ligatures w14:val="none"/>
+        </w:rPr>
+        <w:lastRenderedPageBreak/>
+        <w:t>Assignment 3 was approximately 3.46</w:t>
+      </w:r>
+      <w:r>
+        <w:rPr>
+          <w:rFonts w:eastAsia="Times New Roman" w:cs="Times New Roman"/>
+          <w:kern w:val="0"/>
+          <w14:ligatures w14:val="none"/>
+        </w:rPr>
+        <w:t>x</w:t>
+      </w:r>
+      <w:r>
+        <w:rPr>
+          <w:rFonts w:eastAsia="Times New Roman" w:cs="Times New Roman"/>
+          <w:kern w:val="0"/>
+          <w14:ligatures w14:val="none"/>
+        </w:rPr>
+        <w:t xml:space="preserve"> faster overall based on the real execution time. However, timing each dataset separately revealed that Assignment 2 was faster for smaller matrices, such as </w:t>
+      </w:r>
+      <w:r>
+        <w:rPr>
+          <w:rFonts w:eastAsia="Times New Roman" w:cs="Times New Roman"/>
+          <w:kern w:val="0"/>
+          <w14:ligatures w14:val="none"/>
+        </w:rPr>
+        <w:t>D</w:t>
+      </w:r>
+      <w:r>
+        <w:rPr>
+          <w:rFonts w:eastAsia="Times New Roman" w:cs="Times New Roman"/>
+          <w:kern w:val="0"/>
+          <w14:ligatures w14:val="none"/>
+        </w:rPr>
+        <w:t>ataset</w:t>
+      </w:r>
+      <w:r>
+        <w:rPr>
+          <w:rFonts w:eastAsia="Times New Roman" w:cs="Times New Roman"/>
+          <w:kern w:val="0"/>
+          <w14:ligatures w14:val="none"/>
+        </w:rPr>
+        <w:t>/</w:t>
+      </w:r>
+      <w:r>
+        <w:rPr>
+          <w:rFonts w:eastAsia="Times New Roman" w:cs="Times New Roman"/>
+          <w:kern w:val="0"/>
+          <w14:ligatures w14:val="none"/>
+        </w:rPr>
+        <w:t>0, while Assignment 3 performed better as the matrix sizes increased.</w:t>
+      </w:r>
+    </w:p>
+    <w:p>
+      <w:pPr>
+        <w:pStyle w:val="Heading3"/>
+      </w:pPr>
+      <w:r>
+        <w:t xml:space="preserve">3.1.2 </w:t>
+      </w:r>
+      <w:r>
+        <w:t>Naïve Matrix Multiply Output</w:t>
+      </w:r>
+      <w:r>
+        <w:t xml:space="preserve"> (`time make run`)</w:t>
+      </w:r>
+    </w:p>
+    <w:p>
+      <w:r>
+        <w:rPr>
+          <w:noProof/>
+        </w:rPr>
+        <w:drawing>
+          <wp:inline distT="0" distB="0" distL="0" distR="0" wp14:anchorId="0E3BC491" wp14:editId="1DBCEA7F">
+            <wp:extent cx="5626100" cy="6248400"/>
+            <wp:effectExtent l="0" t="0" r="0" b="0"/>
+            <wp:docPr id="2012421678" name="Picture 4"/>
+            <wp:cNvGraphicFramePr>
+              <a:graphicFrameLocks xmlns:a="http://schemas.openxmlformats.org/drawingml/2006/main" noChangeAspect="1"/>
+            </wp:cNvGraphicFramePr>
+            <a:graphic xmlns:a="http://schemas.openxmlformats.org/drawingml/2006/main">
+              <a:graphicData uri="http://schemas.openxmlformats.org/drawingml/2006/picture">
+                <pic:pic xmlns:pic="http://schemas.openxmlformats.org/drawingml/2006/picture">
+                  <pic:nvPicPr>
+                    <pic:cNvPr id="2012421678" name="Picture 2012421678"/>
+                    <pic:cNvPicPr/>
+                  </pic:nvPicPr>
+                  <pic:blipFill>
+                    <a:blip r:embed="rId8">
+                      <a:extLst>
+                        <a:ext uri="{28A0092B-C50C-407E-A947-70E740481C1C}">
+                          <a14:useLocalDpi xmlns:a14="http://schemas.microsoft.com/office/drawing/2010/main" val="0"/>
+                        </a:ext>
+                      </a:extLst>
+                    </a:blip>
+                    <a:stretch>
+                      <a:fillRect/>
+                    </a:stretch>
+                  </pic:blipFill>
+                  <pic:spPr>
+                    <a:xfrm>
+                      <a:off x="0" y="0"/>
+                      <a:ext cx="5626100" cy="6248400"/>
+                    </a:xfrm>
+                    <a:prstGeom prst="rect">
+                      <a:avLst/>
+                    </a:prstGeom>
+                  </pic:spPr>
+                </pic:pic>
+              </a:graphicData>
+            </a:graphic>
+          </wp:inline>
+        </w:drawing>
+      </w:r>
+    </w:p>
+    <w:p>
+      <w:pPr>
+        <w:pStyle w:val="Heading3"/>
+      </w:pPr>
+      <w:r>
+        <w:t xml:space="preserve">3.1.3 </w:t>
+      </w:r>
+      <w:r>
+        <w:t>Naïve Matrix Multiply Output (`make benchmark`)</w:t>
+      </w:r>
+    </w:p>
+    <w:p>
+      <w:r>
+        <w:t xml:space="preserve">I modified the </w:t>
+      </w:r>
+      <w:proofErr w:type="spellStart"/>
+      <w:r>
+        <w:t>M</w:t>
+      </w:r>
+      <w:r>
+        <w:t>akefile</w:t>
+      </w:r>
+      <w:proofErr w:type="spellEnd"/>
+      <w:r>
+        <w:t xml:space="preserve"> to run `time` for each dataset folder.</w:t>
+      </w:r>
+    </w:p>
+    <w:p>
+      <w:r>
+        <w:rPr>
+          <w:noProof/>
+        </w:rPr>
+        <w:lastRenderedPageBreak/>
+        <w:drawing>
+          <wp:inline distT="0" distB="0" distL="0" distR="0" wp14:anchorId="693F9368" wp14:editId="7212E1FE">
+            <wp:extent cx="2501900" cy="7175500"/>
+            <wp:effectExtent l="0" t="0" r="0" b="0"/>
+            <wp:docPr id="567354686" name="Picture 5"/>
+            <wp:cNvGraphicFramePr>
+              <a:graphicFrameLocks xmlns:a="http://schemas.openxmlformats.org/drawingml/2006/main" noChangeAspect="1"/>
+            </wp:cNvGraphicFramePr>
+            <a:graphic xmlns:a="http://schemas.openxmlformats.org/drawingml/2006/main">
+              <a:graphicData uri="http://schemas.openxmlformats.org/drawingml/2006/picture">
+                <pic:pic xmlns:pic="http://schemas.openxmlformats.org/drawingml/2006/picture">
+                  <pic:nvPicPr>
+                    <pic:cNvPr id="567354686" name="Picture 567354686"/>
+                    <pic:cNvPicPr/>
+                  </pic:nvPicPr>
+                  <pic:blipFill>
+                    <a:blip r:embed="rId9">
+                      <a:extLst>
+                        <a:ext uri="{28A0092B-C50C-407E-A947-70E740481C1C}">
+                          <a14:useLocalDpi xmlns:a14="http://schemas.microsoft.com/office/drawing/2010/main" val="0"/>
+                        </a:ext>
+                      </a:extLst>
+                    </a:blip>
+                    <a:stretch>
+                      <a:fillRect/>
+                    </a:stretch>
+                  </pic:blipFill>
+                  <pic:spPr>
+                    <a:xfrm>
+                      <a:off x="0" y="0"/>
+                      <a:ext cx="2501900" cy="7175500"/>
+                    </a:xfrm>
+                    <a:prstGeom prst="rect">
+                      <a:avLst/>
+                    </a:prstGeom>
+                  </pic:spPr>
+                </pic:pic>
+              </a:graphicData>
+            </a:graphic>
+          </wp:inline>
+        </w:drawing>
+      </w:r>
+    </w:p>
+    <w:p>
+      <w:pPr>
+        <w:pStyle w:val="Heading3"/>
+      </w:pPr>
+    </w:p>
+    <w:p>
+      <w:pPr>
+        <w:pStyle w:val="Heading3"/>
+      </w:pPr>
+    </w:p>
+    <w:p>
+      <w:pPr>
+        <w:pStyle w:val="Heading3"/>
+      </w:pPr>
+      <w:r>
+        <w:t xml:space="preserve">3.2 </w:t>
+      </w:r>
+      <w:proofErr w:type="spellStart"/>
+      <w:r>
+        <w:t>OpenCl</w:t>
+      </w:r>
+      <w:proofErr w:type="spellEnd"/>
+      <w:r>
+        <w:t xml:space="preserve"> Tiled Matrix Multiplication</w:t>
+      </w:r>
+    </w:p>
+    <w:tbl>
+      <w:tblPr>
+        <w:tblW w:w="9360" w:type="dxa"/>
+        <w:tblCellSpacing w:w="15" w:type="dxa"/>
+        <w:tblCellMar>
+          <w:top w:w="15" w:type="dxa"/>
+          <w:left w:w="15" w:type="dxa"/>
+          <w:bottom w:w="15" w:type="dxa"/>
+          <w:right w:w="15" w:type="dxa"/>
+        </w:tblCellMar>
+        <w:tblLook w:val="04A0" w:firstRow="1" w:lastRow="0" w:firstColumn="1" w:lastColumn="0" w:noHBand="0" w:noVBand="1"/>
+      </w:tblPr>
+      <w:tblGrid>
+        <w:gridCol w:w="1968"/>
+        <w:gridCol w:w="2712"/>
+        <w:gridCol w:w="2700"/>
+        <w:gridCol w:w="1980"/>
+      </w:tblGrid>
+      <w:tr>
+        <w:trPr>
+          <w:trHeight w:val="62"/>
+          <w:tblCellSpacing w:w="15" w:type="dxa"/>
+        </w:trPr>
+        <w:tc>
+          <w:tcPr>
+            <w:tcW w:w="1923" w:type="dxa"/>
+            <w:vAlign w:val="center"/>
+            <w:hideMark/>
+          </w:tcPr>
+          <w:p>
+            <w:pPr>
+              <w:spacing w:after="0" w:line="240" w:lineRule="auto"/>
+              <w:rPr>
+                <w:rFonts w:eastAsia="Times New Roman" w:cs="Times New Roman"/>
+                <w:b/>
+                <w:bCs/>
+                <w:kern w:val="0"/>
+                <w14:ligatures w14:val="none"/>
+              </w:rPr>
+            </w:pPr>
+            <w:r>
+              <w:rPr>
+                <w:rFonts w:eastAsia="Times New Roman" w:cs="Times New Roman"/>
+                <w:b/>
+                <w:bCs/>
+                <w:kern w:val="0"/>
+                <w14:ligatures w14:val="none"/>
+              </w:rPr>
+              <w:t>Measurement</w:t>
+            </w:r>
+          </w:p>
+        </w:tc>
+        <w:tc>
+          <w:tcPr>
+            <w:tcW w:w="2682" w:type="dxa"/>
+            <w:vAlign w:val="center"/>
+            <w:hideMark/>
+          </w:tcPr>
+          <w:p>
+            <w:pPr>
+              <w:spacing w:after="0" w:line="240" w:lineRule="auto"/>
+              <w:rPr>
+                <w:rFonts w:eastAsia="Times New Roman" w:cs="Times New Roman"/>
+                <w:b/>
+                <w:bCs/>
+                <w:kern w:val="0"/>
+                <w14:ligatures w14:val="none"/>
+              </w:rPr>
+            </w:pPr>
+            <w:r>
+              <w:rPr>
+                <w:rFonts w:eastAsia="Times New Roman" w:cs="Times New Roman"/>
+                <w:b/>
+                <w:bCs/>
+                <w:kern w:val="0"/>
+                <w14:ligatures w14:val="none"/>
+              </w:rPr>
+              <w:t>3.1 OpenCL Naïve MM</w:t>
+            </w:r>
+          </w:p>
+        </w:tc>
+        <w:tc>
+          <w:tcPr>
+            <w:tcW w:w="2670" w:type="dxa"/>
+          </w:tcPr>
+          <w:p>
+            <w:pPr>
+              <w:spacing w:after="0" w:line="240" w:lineRule="auto"/>
+              <w:rPr>
+                <w:rFonts w:eastAsia="Times New Roman" w:cs="Times New Roman"/>
+                <w:b/>
+                <w:bCs/>
+                <w:kern w:val="0"/>
+                <w14:ligatures w14:val="none"/>
+              </w:rPr>
+            </w:pPr>
+            <w:r>
+              <w:rPr>
+                <w:rFonts w:eastAsia="Times New Roman" w:cs="Times New Roman"/>
+                <w:b/>
+                <w:bCs/>
+                <w:kern w:val="0"/>
+                <w14:ligatures w14:val="none"/>
+              </w:rPr>
+              <w:t>3.2 OpenCL Tiled MM</w:t>
+            </w:r>
+          </w:p>
+        </w:tc>
+        <w:tc>
+          <w:tcPr>
+            <w:tcW w:w="1935" w:type="dxa"/>
+          </w:tcPr>
+          <w:p>
+            <w:pPr>
+              <w:spacing w:after="0" w:line="240" w:lineRule="auto"/>
+              <w:rPr>
+                <w:rFonts w:eastAsia="Times New Roman" w:cs="Times New Roman"/>
+                <w:b/>
+                <w:bCs/>
+                <w:kern w:val="0"/>
+                <w14:ligatures w14:val="none"/>
+              </w:rPr>
+            </w:pPr>
+            <w:r>
+              <w:rPr>
+                <w:rFonts w:eastAsia="Times New Roman" w:cs="Times New Roman"/>
+                <w:b/>
+                <w:bCs/>
+                <w:kern w:val="0"/>
+                <w14:ligatures w14:val="none"/>
+              </w:rPr>
+              <w:t>Speedup (x)</w:t>
+            </w:r>
+          </w:p>
+        </w:tc>
+      </w:tr>
+      <w:tr>
+        <w:trPr>
+          <w:trHeight w:val="78"/>
+          <w:tblCellSpacing w:w="15" w:type="dxa"/>
+        </w:trPr>
+        <w:tc>
+          <w:tcPr>
+            <w:tcW w:w="1923" w:type="dxa"/>
+            <w:vAlign w:val="center"/>
+            <w:hideMark/>
+          </w:tcPr>
+          <w:p>
+            <w:r>
+              <w:t>Real time</w:t>
+            </w:r>
+          </w:p>
+        </w:tc>
+        <w:tc>
+          <w:tcPr>
+            <w:tcW w:w="2682" w:type="dxa"/>
+            <w:vAlign w:val="center"/>
+            <w:hideMark/>
+          </w:tcPr>
+          <w:p>
+            <w:r>
+              <w:t>0m 50.718s</w:t>
+            </w:r>
+          </w:p>
+        </w:tc>
+        <w:tc>
+          <w:tcPr>
+            <w:tcW w:w="2670" w:type="dxa"/>
+          </w:tcPr>
+          <w:p>
+            <w:r>
+              <w:t>0m4.310s</w:t>
+            </w:r>
+          </w:p>
+        </w:tc>
+        <w:tc>
+          <w:tcPr>
+            <w:tcW w:w="1935" w:type="dxa"/>
+          </w:tcPr>
+          <w:p>
+            <w:r>
+              <w:t>11.77x</w:t>
+            </w:r>
+          </w:p>
+        </w:tc>
+      </w:tr>
+      <w:tr>
+        <w:trPr>
+          <w:trHeight w:val="317"/>
+          <w:tblCellSpacing w:w="15" w:type="dxa"/>
+        </w:trPr>
+        <w:tc>
+          <w:tcPr>
+            <w:tcW w:w="1923" w:type="dxa"/>
+            <w:vAlign w:val="center"/>
+            <w:hideMark/>
+          </w:tcPr>
+          <w:p>
+            <w:r>
+              <w:t>User time</w:t>
+            </w:r>
+          </w:p>
+        </w:tc>
+        <w:tc>
+          <w:tcPr>
+            <w:tcW w:w="2682" w:type="dxa"/>
+            <w:vAlign w:val="center"/>
+            <w:hideMark/>
+          </w:tcPr>
+          <w:p>
+            <w:r>
+              <w:t>0m 2.154s</w:t>
+            </w:r>
+          </w:p>
+        </w:tc>
+        <w:tc>
+          <w:tcPr>
+            <w:tcW w:w="2670" w:type="dxa"/>
+          </w:tcPr>
+          <w:p>
+            <w:r>
+              <w:t>0m2.258s</w:t>
+            </w:r>
+          </w:p>
+        </w:tc>
+        <w:tc>
+          <w:tcPr>
+            <w:tcW w:w="1935" w:type="dxa"/>
+          </w:tcPr>
+          <w:p/>
+        </w:tc>
+      </w:tr>
+      <w:tr>
+        <w:trPr>
+          <w:trHeight w:val="317"/>
+          <w:tblCellSpacing w:w="15" w:type="dxa"/>
+        </w:trPr>
+        <w:tc>
+          <w:tcPr>
+            <w:tcW w:w="1923" w:type="dxa"/>
+            <w:vAlign w:val="center"/>
+            <w:hideMark/>
+          </w:tcPr>
+          <w:p>
+            <w:r>
+              <w:t>System time</w:t>
+            </w:r>
+          </w:p>
+        </w:tc>
+        <w:tc>
+          <w:tcPr>
+            <w:tcW w:w="2682" w:type="dxa"/>
+            <w:vAlign w:val="center"/>
+            <w:hideMark/>
+          </w:tcPr>
+          <w:p>
+            <w:r>
+              <w:t>0m 0.755s</w:t>
+            </w:r>
+          </w:p>
+        </w:tc>
+        <w:tc>
+          <w:tcPr>
+            <w:tcW w:w="2670" w:type="dxa"/>
+          </w:tcPr>
+          <w:p>
+            <w:r>
+              <w:t>0m0.785s</w:t>
+            </w:r>
+          </w:p>
+        </w:tc>
+        <w:tc>
+          <w:tcPr>
+            <w:tcW w:w="1935" w:type="dxa"/>
+          </w:tcPr>
+          <w:p/>
+        </w:tc>
+      </w:tr>
+    </w:tbl>
+    <w:p>
+      <w:r>
+        <w:t>The tiled OpenCL matrix multiplication achieved an 11.77</w:t>
+      </w:r>
+      <w:r>
+        <w:t>x</w:t>
+      </w:r>
+      <w:r>
+        <w:t xml:space="preserve"> speedup over the naive OpenCL implementation.</w:t>
+      </w:r>
+    </w:p>
+    <w:p>
+      <w:pPr>
+        <w:pStyle w:val="Heading3"/>
+      </w:pPr>
+      <w:r>
+        <w:lastRenderedPageBreak/>
+        <w:t>3.2</w:t>
+      </w:r>
+      <w:r>
+        <w:t>.1</w:t>
+      </w:r>
+      <w:r>
+        <w:t xml:space="preserve"> </w:t>
+      </w:r>
+      <w:proofErr w:type="spellStart"/>
+      <w:r>
+        <w:t>OpenCl</w:t>
+      </w:r>
+      <w:proofErr w:type="spellEnd"/>
+      <w:r>
+        <w:t xml:space="preserve"> Tiled Matrix Multiplication Output (`time make run`)</w:t>
+      </w:r>
+    </w:p>
+    <w:p>
+      <w:pPr>
+        <w:pStyle w:val="NoSpacing"/>
+      </w:pPr>
+      <w:r>
+        <w:rPr>
+          <w:noProof/>
+        </w:rPr>
+        <w:drawing>
+          <wp:inline distT="0" distB="0" distL="0" distR="0" wp14:anchorId="2B87E202" wp14:editId="16F6206D">
+            <wp:extent cx="5626100" cy="6235700"/>
+            <wp:effectExtent l="0" t="0" r="0" b="0"/>
+            <wp:docPr id="1324702802" name="Picture 6"/>
+            <wp:cNvGraphicFramePr>
+              <a:graphicFrameLocks xmlns:a="http://schemas.openxmlformats.org/drawingml/2006/main" noChangeAspect="1"/>
+            </wp:cNvGraphicFramePr>
+            <a:graphic xmlns:a="http://schemas.openxmlformats.org/drawingml/2006/main">
+              <a:graphicData uri="http://schemas.openxmlformats.org/drawingml/2006/picture">
+                <pic:pic xmlns:pic="http://schemas.openxmlformats.org/drawingml/2006/picture">
+                  <pic:nvPicPr>
+                    <pic:cNvPr id="1324702802" name="Picture 1324702802"/>
+                    <pic:cNvPicPr/>
+                  </pic:nvPicPr>
+                  <pic:blipFill>
+                    <a:blip r:embed="rId10">
+                      <a:extLst>
+                        <a:ext uri="{28A0092B-C50C-407E-A947-70E740481C1C}">
+                          <a14:useLocalDpi xmlns:a14="http://schemas.microsoft.com/office/drawing/2010/main" val="0"/>
+                        </a:ext>
+                      </a:extLst>
+                    </a:blip>
+                    <a:stretch>
+                      <a:fillRect/>
+                    </a:stretch>
+                  </pic:blipFill>
+                  <pic:spPr>
+                    <a:xfrm>
+                      <a:off x="0" y="0"/>
+                      <a:ext cx="5626100" cy="6235700"/>
+                    </a:xfrm>
+                    <a:prstGeom prst="rect">
+                      <a:avLst/>
+                    </a:prstGeom>
+                  </pic:spPr>
+                </pic:pic>
+              </a:graphicData>
+            </a:graphic>
+          </wp:inline>
+        </w:drawing>
+      </w:r>
+    </w:p>
+    <w:p>
+      <w:pPr>
+        <w:pStyle w:val="NoSpacing"/>
+      </w:pPr>
+    </w:p>
+    <w:p>
+      <w:pPr>
+        <w:pStyle w:val="Heading3"/>
+      </w:pPr>
+    </w:p>
+    <w:p>
+      <w:pPr>
+        <w:pStyle w:val="Heading3"/>
+      </w:pPr>
+    </w:p>
+    <w:p>
+      <w:pPr>
+        <w:pStyle w:val="Heading3"/>
+      </w:pPr>
+    </w:p>
+    <w:p>
+      <w:pPr>
+        <w:pStyle w:val="Heading3"/>
+      </w:pPr>
+      <w:r>
+        <w:t xml:space="preserve">3.3 </w:t>
+      </w:r>
+      <w:r>
+        <w:t>Neon Block Matrix Multiplication</w:t>
+      </w:r>
+    </w:p>
+    <w:p>
+      <w:pPr>
+        <w:pStyle w:val="NoSpacing"/>
+      </w:pPr>
+      <w:r>
+        <w:t>I tested block sizes of 16, 32, 64, 128, 256, 512, and 1024 and found that performance stopped improving beyond a block size of 256.</w:t>
+      </w:r>
+    </w:p>
+    <w:p>
+      <w:pPr>
+        <w:pStyle w:val="NoSpacing"/>
+      </w:pPr>
+    </w:p>
+    <w:p>
+      <w:pPr>
+        <w:pStyle w:val="NoSpacing"/>
+      </w:pPr>
+      <w:r>
+        <w:rPr>
+          <w:noProof/>
+        </w:rPr>
+        <w:drawing>
+          <wp:inline distT="0" distB="0" distL="0" distR="0" wp14:anchorId="6D6B6C82" wp14:editId="4D2E9855">
+            <wp:extent cx="4572000" cy="2743200"/>
+            <wp:effectExtent l="0" t="0" r="12700" b="12700"/>
+            <wp:docPr id="733222409" name="Chart 1">
+              <a:extLst xmlns:a="http://schemas.openxmlformats.org/drawingml/2006/main">
+                <a:ext uri="{FF2B5EF4-FFF2-40B4-BE49-F238E27FC236}">
+                  <a16:creationId xmlns:a16="http://schemas.microsoft.com/office/drawing/2014/main" id="{A0AE86E6-A45A-6016-BF59-3AD721C48510}"/>
+                </a:ext>
+              </a:extLst>
+            </wp:docPr>
+            <wp:cNvGraphicFramePr/>
+            <a:graphic xmlns:a="http://schemas.openxmlformats.org/drawingml/2006/main">
+              <a:graphicData uri="http://schemas.openxmlformats.org/drawingml/2006/chart">
+                <c:chart xmlns:c="http://schemas.openxmlformats.org/drawingml/2006/chart" xmlns:r="http://schemas.openxmlformats.org/officeDocument/2006/relationships" r:id="rId11"/>
+              </a:graphicData>
+            </a:graphic>
+          </wp:inline>
+        </w:drawing>
+      </w:r>
+    </w:p>
+    <w:p>
+      <w:pPr>
+        <w:pStyle w:val="NoSpacing"/>
+      </w:pPr>
+    </w:p>
+    <w:tbl>
+      <w:tblPr>
+        <w:tblW w:w="10449" w:type="dxa"/>
+        <w:tblCellSpacing w:w="15" w:type="dxa"/>
+        <w:tblCellMar>
+          <w:top w:w="15" w:type="dxa"/>
+          <w:left w:w="15" w:type="dxa"/>
+          <w:bottom w:w="15" w:type="dxa"/>
+          <w:right w:w="15" w:type="dxa"/>
+        </w:tblCellMar>
+        <w:tblLook w:val="04A0" w:firstRow="1" w:lastRow="0" w:firstColumn="1" w:lastColumn="0" w:noHBand="0" w:noVBand="1"/>
+      </w:tblPr>
+      <w:tblGrid>
+        <w:gridCol w:w="1800"/>
+        <w:gridCol w:w="2340"/>
+        <w:gridCol w:w="2340"/>
+        <w:gridCol w:w="2430"/>
+        <w:gridCol w:w="1539"/>
+      </w:tblGrid>
+      <w:tr>
+        <w:trPr>
+          <w:trHeight w:val="58"/>
+          <w:tblCellSpacing w:w="15" w:type="dxa"/>
+        </w:trPr>
+        <w:tc>
+          <w:tcPr>
+            <w:tcW w:w="1755" w:type="dxa"/>
+            <w:vAlign w:val="center"/>
+            <w:hideMark/>
+          </w:tcPr>
+          <w:p>
+            <w:pPr>
+              <w:spacing w:after="0" w:line="240" w:lineRule="auto"/>
+              <w:rPr>
+                <w:rFonts w:eastAsia="Times New Roman" w:cs="Times New Roman"/>
+                <w:b/>
+                <w:bCs/>
+                <w:kern w:val="0"/>
+                <w14:ligatures w14:val="none"/>
+              </w:rPr>
+            </w:pPr>
+            <w:r>
+              <w:rPr>
+                <w:rFonts w:eastAsia="Times New Roman" w:cs="Times New Roman"/>
+                <w:b/>
+                <w:bCs/>
+                <w:kern w:val="0"/>
+                <w14:ligatures w14:val="none"/>
+              </w:rPr>
+              <w:t>Measurement</w:t>
+            </w:r>
+          </w:p>
+        </w:tc>
+        <w:tc>
+          <w:tcPr>
+            <w:tcW w:w="2310" w:type="dxa"/>
+            <w:vAlign w:val="center"/>
+            <w:hideMark/>
+          </w:tcPr>
+          <w:p>
+            <w:pPr>
+              <w:spacing w:after="0" w:line="240" w:lineRule="auto"/>
+              <w:rPr>
+                <w:rFonts w:eastAsia="Times New Roman" w:cs="Times New Roman"/>
+                <w:b/>
+                <w:bCs/>
+                <w:kern w:val="0"/>
+                <w14:ligatures w14:val="none"/>
+              </w:rPr>
+            </w:pPr>
+            <w:r>
+              <w:rPr>
+                <w:rFonts w:eastAsia="Times New Roman" w:cs="Times New Roman"/>
+                <w:b/>
+                <w:bCs/>
+                <w:kern w:val="0"/>
+                <w14:ligatures w14:val="none"/>
+              </w:rPr>
+              <w:t>3.1 OpenCL Naïve MM</w:t>
+            </w:r>
+          </w:p>
+        </w:tc>
+        <w:tc>
+          <w:tcPr>
+            <w:tcW w:w="2310" w:type="dxa"/>
+          </w:tcPr>
+          <w:p>
+            <w:pPr>
+              <w:spacing w:after="0" w:line="240" w:lineRule="auto"/>
+              <w:rPr>
+                <w:rFonts w:eastAsia="Times New Roman" w:cs="Times New Roman"/>
+                <w:b/>
+                <w:bCs/>
+                <w:kern w:val="0"/>
+                <w14:ligatures w14:val="none"/>
+              </w:rPr>
+            </w:pPr>
+            <w:r>
+              <w:rPr>
+                <w:rFonts w:eastAsia="Times New Roman" w:cs="Times New Roman"/>
+                <w:b/>
+                <w:bCs/>
+                <w:kern w:val="0"/>
+                <w14:ligatures w14:val="none"/>
+              </w:rPr>
+              <w:t>3.2 OpenCL Tiled MM</w:t>
+            </w:r>
+          </w:p>
+        </w:tc>
+        <w:tc>
+          <w:tcPr>
+            <w:tcW w:w="2400" w:type="dxa"/>
+          </w:tcPr>
+          <w:p>
+            <w:pPr>
+              <w:spacing w:after="0" w:line="240" w:lineRule="auto"/>
+              <w:rPr>
+                <w:rFonts w:eastAsia="Times New Roman" w:cs="Times New Roman"/>
+                <w:b/>
+                <w:bCs/>
+                <w:kern w:val="0"/>
+                <w14:ligatures w14:val="none"/>
+              </w:rPr>
+            </w:pPr>
+            <w:r>
+              <w:rPr>
+                <w:rFonts w:eastAsia="Times New Roman" w:cs="Times New Roman"/>
+                <w:b/>
+                <w:bCs/>
+                <w:kern w:val="0"/>
+                <w14:ligatures w14:val="none"/>
+              </w:rPr>
+              <w:t>3.3 Neon Block MM</w:t>
+            </w:r>
+            <w:r>
+              <w:rPr>
+                <w:rFonts w:eastAsia="Times New Roman" w:cs="Times New Roman"/>
+                <w:b/>
+                <w:bCs/>
+                <w:kern w:val="0"/>
+                <w14:ligatures w14:val="none"/>
+              </w:rPr>
+              <w:t xml:space="preserve"> (</w:t>
+            </w:r>
+            <w:r>
+              <w:rPr>
+                <w:rFonts w:eastAsia="Times New Roman" w:cs="Times New Roman"/>
+                <w:b/>
+                <w:bCs/>
+                <w:kern w:val="0"/>
+                <w14:ligatures w14:val="none"/>
+              </w:rPr>
+              <w:t>256</w:t>
+            </w:r>
+            <w:r>
+              <w:rPr>
+                <w:rFonts w:eastAsia="Times New Roman" w:cs="Times New Roman"/>
+                <w:b/>
+                <w:bCs/>
+                <w:kern w:val="0"/>
+                <w14:ligatures w14:val="none"/>
+              </w:rPr>
+              <w:t>x</w:t>
+            </w:r>
+            <w:r>
+              <w:rPr>
+                <w:rFonts w:eastAsia="Times New Roman" w:cs="Times New Roman"/>
+                <w:b/>
+                <w:bCs/>
+                <w:kern w:val="0"/>
+                <w14:ligatures w14:val="none"/>
+              </w:rPr>
+              <w:t>256</w:t>
+            </w:r>
+            <w:r>
+              <w:rPr>
+                <w:rFonts w:eastAsia="Times New Roman" w:cs="Times New Roman"/>
+                <w:b/>
+                <w:bCs/>
+                <w:kern w:val="0"/>
+                <w14:ligatures w14:val="none"/>
+              </w:rPr>
+              <w:t xml:space="preserve"> Block)</w:t>
+            </w:r>
+          </w:p>
+        </w:tc>
+        <w:tc>
+          <w:tcPr>
+            <w:tcW w:w="1494" w:type="dxa"/>
+          </w:tcPr>
+          <w:p>
+            <w:pPr>
+              <w:spacing w:after="0" w:line="240" w:lineRule="auto"/>
+              <w:rPr>
+                <w:rFonts w:eastAsia="Times New Roman" w:cs="Times New Roman"/>
+                <w:b/>
+                <w:bCs/>
+                <w:kern w:val="0"/>
+                <w14:ligatures w14:val="none"/>
+              </w:rPr>
+            </w:pPr>
+          </w:p>
+        </w:tc>
+      </w:tr>
+      <w:tr>
+        <w:trPr>
+          <w:trHeight w:val="73"/>
+          <w:tblCellSpacing w:w="15" w:type="dxa"/>
+        </w:trPr>
+        <w:tc>
+          <w:tcPr>
+            <w:tcW w:w="1755" w:type="dxa"/>
+            <w:vAlign w:val="center"/>
+            <w:hideMark/>
+          </w:tcPr>
+          <w:p>
+            <w:r>
+              <w:t>Real time</w:t>
+            </w:r>
+          </w:p>
+        </w:tc>
+        <w:tc>
+          <w:tcPr>
+            <w:tcW w:w="2310" w:type="dxa"/>
+            <w:vAlign w:val="center"/>
+            <w:hideMark/>
+          </w:tcPr>
+          <w:p>
+            <w:r>
+              <w:t>0m 50.718s</w:t>
+            </w:r>
+          </w:p>
+        </w:tc>
+        <w:tc>
+          <w:tcPr>
+            <w:tcW w:w="2310" w:type="dxa"/>
+          </w:tcPr>
+          <w:p>
+            <w:r>
+              <w:t>0m4.310s</w:t>
+            </w:r>
+          </w:p>
+        </w:tc>
+        <w:tc>
+          <w:tcPr>
+            <w:tcW w:w="2400" w:type="dxa"/>
+          </w:tcPr>
+          <w:p>
+            <w:r>
+              <w:t>0m2</w:t>
+            </w:r>
+            <w:r>
+              <w:t>4</w:t>
+            </w:r>
+            <w:r>
+              <w:t>.9</w:t>
+            </w:r>
+            <w:r>
+              <w:t>5</w:t>
+            </w:r>
+            <w:r>
+              <w:t>4s</w:t>
+            </w:r>
+          </w:p>
+        </w:tc>
+        <w:tc>
+          <w:tcPr>
+            <w:tcW w:w="1494" w:type="dxa"/>
+          </w:tcPr>
+          <w:p/>
+        </w:tc>
+      </w:tr>
+      <w:tr>
+        <w:trPr>
+          <w:trHeight w:val="300"/>
+          <w:tblCellSpacing w:w="15" w:type="dxa"/>
+        </w:trPr>
+        <w:tc>
+          <w:tcPr>
+            <w:tcW w:w="1755" w:type="dxa"/>
+            <w:vAlign w:val="center"/>
+            <w:hideMark/>
+          </w:tcPr>
+          <w:p>
+            <w:r>
+              <w:t>User time</w:t>
+            </w:r>
+          </w:p>
+        </w:tc>
+        <w:tc>
+          <w:tcPr>
+            <w:tcW w:w="2310" w:type="dxa"/>
+            <w:vAlign w:val="center"/>
+            <w:hideMark/>
+          </w:tcPr>
+          <w:p>
+            <w:r>
+              <w:t>0m 2.154s</w:t>
+            </w:r>
+          </w:p>
+        </w:tc>
+        <w:tc>
+          <w:tcPr>
+            <w:tcW w:w="2310" w:type="dxa"/>
+          </w:tcPr>
+          <w:p>
+            <w:r>
+              <w:t>0m2.258s</w:t>
+            </w:r>
+          </w:p>
+        </w:tc>
+        <w:tc>
+          <w:tcPr>
+            <w:tcW w:w="2400" w:type="dxa"/>
+          </w:tcPr>
+          <w:p>
+            <w:r>
+              <w:t>0m2</w:t>
+            </w:r>
+            <w:r>
+              <w:t>4</w:t>
+            </w:r>
+            <w:r>
+              <w:t>.5</w:t>
+            </w:r>
+            <w:r>
+              <w:t>12</w:t>
+            </w:r>
+            <w:r>
+              <w:t>s</w:t>
+            </w:r>
+          </w:p>
+        </w:tc>
+        <w:tc>
+          <w:tcPr>
+            <w:tcW w:w="1494" w:type="dxa"/>
+          </w:tcPr>
+          <w:p/>
+        </w:tc>
+      </w:tr>
+      <w:tr>
+        <w:trPr>
+          <w:trHeight w:val="300"/>
+          <w:tblCellSpacing w:w="15" w:type="dxa"/>
+        </w:trPr>
+        <w:tc>
+          <w:tcPr>
+            <w:tcW w:w="1755" w:type="dxa"/>
+            <w:vAlign w:val="center"/>
+            <w:hideMark/>
+          </w:tcPr>
+          <w:p>
+            <w:r>
+              <w:t>System time</w:t>
+            </w:r>
+          </w:p>
+        </w:tc>
+        <w:tc>
+          <w:tcPr>
+            <w:tcW w:w="2310" w:type="dxa"/>
+            <w:vAlign w:val="center"/>
+            <w:hideMark/>
+          </w:tcPr>
+          <w:p>
+            <w:r>
+              <w:t>0m 0.755s</w:t>
+            </w:r>
+          </w:p>
+        </w:tc>
+        <w:tc>
+          <w:tcPr>
+            <w:tcW w:w="2310" w:type="dxa"/>
+          </w:tcPr>
+          <w:p>
+            <w:r>
+              <w:t>0m0.785s</w:t>
+            </w:r>
+          </w:p>
+        </w:tc>
+        <w:tc>
+          <w:tcPr>
+            <w:tcW w:w="2400" w:type="dxa"/>
+          </w:tcPr>
+          <w:p>
+            <w:r>
+              <w:t>0m0.3</w:t>
+            </w:r>
+            <w:r>
+              <w:t>23</w:t>
+            </w:r>
+            <w:r>
+              <w:t>s</w:t>
+            </w:r>
+          </w:p>
+        </w:tc>
+        <w:tc>
+          <w:tcPr>
+            <w:tcW w:w="1494" w:type="dxa"/>
+          </w:tcPr>
+          <w:p/>
+        </w:tc>
+      </w:tr>
+    </w:tbl>
+    <w:p>
+      <w:pPr>
+        <w:pStyle w:val="NoSpacing"/>
+      </w:pPr>
+    </w:p>
+    <w:p>
+      <w:pPr>
+        <w:pStyle w:val="Heading3"/>
+      </w:pPr>
+    </w:p>
+    <w:p>
+      <w:pPr>
+        <w:pStyle w:val="Heading3"/>
+        <w:rPr>
+          <w:noProof/>
+        </w:rPr>
+      </w:pPr>
+      <w:r>
+        <w:t>3.3</w:t>
+      </w:r>
+      <w:r>
+        <w:t>.1</w:t>
+      </w:r>
+      <w:r>
+        <w:t xml:space="preserve"> Neon Block Matrix Multiplication</w:t>
+      </w:r>
+      <w:r>
+        <w:rPr>
+          <w:noProof/>
+        </w:rPr>
+        <w:t xml:space="preserve"> `time make run` output</w:t>
+      </w:r>
+    </w:p>
+    <w:p>
+      <w:pPr>
+        <w:pStyle w:val="Heading3"/>
+      </w:pPr>
+      <w:r>
+        <w:t>3.3.1.1 16x16 Block Size</w:t>
+      </w:r>
+    </w:p>
+    <w:p>
+      <w:r>
+        <w:rPr>
+          <w:noProof/>
+        </w:rPr>
+        <w:drawing>
+          <wp:inline distT="0" distB="0" distL="0" distR="0" wp14:anchorId="59E3D046" wp14:editId="60E29C3A">
+            <wp:extent cx="5943600" cy="3713480"/>
+            <wp:effectExtent l="0" t="0" r="0" b="0"/>
+            <wp:docPr id="1980732162" name="Picture 3"/>
+            <wp:cNvGraphicFramePr>
+              <a:graphicFrameLocks xmlns:a="http://schemas.openxmlformats.org/drawingml/2006/main" noChangeAspect="1"/>
+            </wp:cNvGraphicFramePr>
+            <a:graphic xmlns:a="http://schemas.openxmlformats.org/drawingml/2006/main">
+              <a:graphicData uri="http://schemas.openxmlformats.org/drawingml/2006/picture">
+                <pic:pic xmlns:pic="http://schemas.openxmlformats.org/drawingml/2006/picture">
+                  <pic:nvPicPr>
+                    <pic:cNvPr id="1980732162" name="Picture 1980732162"/>
+                    <pic:cNvPicPr/>
+                  </pic:nvPicPr>
+                  <pic:blipFill>
+                    <a:blip r:embed="rId12">
+                      <a:extLst>
+                        <a:ext uri="{28A0092B-C50C-407E-A947-70E740481C1C}">
+                          <a14:useLocalDpi xmlns:a14="http://schemas.microsoft.com/office/drawing/2010/main" val="0"/>
+                        </a:ext>
+                      </a:extLst>
+                    </a:blip>
+                    <a:stretch>
+                      <a:fillRect/>
+                    </a:stretch>
+                  </pic:blipFill>
+                  <pic:spPr>
+                    <a:xfrm>
+                      <a:off x="0" y="0"/>
+                      <a:ext cx="5943600" cy="3713480"/>
+                    </a:xfrm>
+                    <a:prstGeom prst="rect">
+                      <a:avLst/>
+                    </a:prstGeom>
+                  </pic:spPr>
+                </pic:pic>
+              </a:graphicData>
+            </a:graphic>
+          </wp:inline>
+        </w:drawing>
+      </w:r>
+    </w:p>
+    <w:p>
+      <w:pPr>
+        <w:pStyle w:val="Heading3"/>
+        <w:rPr>
+          <w:noProof/>
+        </w:rPr>
+      </w:pPr>
+      <w:r>
+        <w:rPr>
+          <w:noProof/>
+        </w:rPr>
+        <w:t>3.3.1.2 32x32 Block Size</w:t>
+      </w:r>
+      <w:r>
+        <w:rPr>
+          <w:noProof/>
+        </w:rPr>
+        <w:drawing>
+          <wp:inline distT="0" distB="0" distL="0" distR="0" wp14:anchorId="27833347" wp14:editId="13997977">
+            <wp:extent cx="5943600" cy="2566670"/>
+            <wp:effectExtent l="0" t="0" r="0" b="0"/>
+            <wp:docPr id="1637290987" name="Picture 1"/>
+            <wp:cNvGraphicFramePr>
+              <a:graphicFrameLocks xmlns:a="http://schemas.openxmlformats.org/drawingml/2006/main" noChangeAspect="1"/>
+            </wp:cNvGraphicFramePr>
+            <a:graphic xmlns:a="http://schemas.openxmlformats.org/drawingml/2006/main">
+              <a:graphicData uri="http://schemas.openxmlformats.org/drawingml/2006/picture">
+                <pic:pic xmlns:pic="http://schemas.openxmlformats.org/drawingml/2006/picture">
+                  <pic:nvPicPr>
+                    <pic:cNvPr id="1637290987" name="Picture 1637290987"/>
+                    <pic:cNvPicPr/>
+                  </pic:nvPicPr>
+                  <pic:blipFill>
+                    <a:blip r:embed="rId13" cstate="print">
+                      <a:extLst>
+                        <a:ext uri="{28A0092B-C50C-407E-A947-70E740481C1C}">
+                          <a14:useLocalDpi xmlns:a14="http://schemas.microsoft.com/office/drawing/2010/main" val="0"/>
+                        </a:ext>
+                      </a:extLst>
+                    </a:blip>
+                    <a:stretch>
+                      <a:fillRect/>
+                    </a:stretch>
+                  </pic:blipFill>
+                  <pic:spPr>
+                    <a:xfrm>
+                      <a:off x="0" y="0"/>
+                      <a:ext cx="5943600" cy="2566670"/>
+                    </a:xfrm>
+                    <a:prstGeom prst="rect">
+                      <a:avLst/>
+                    </a:prstGeom>
+                  </pic:spPr>
+                </pic:pic>
+              </a:graphicData>
+            </a:graphic>
+          </wp:inline>
+        </w:drawing>
+      </w:r>
+    </w:p>
+    <w:p>
+      <w:pPr>
+        <w:pStyle w:val="NoSpacing"/>
+      </w:pPr>
+    </w:p>
+    <w:p>
+      <w:pPr>
+        <w:pStyle w:val="Heading3"/>
+        <w:rPr>
+          <w:noProof/>
+        </w:rPr>
+      </w:pPr>
+      <w:r>
+        <w:rPr>
+          <w:noProof/>
+        </w:rPr>
+        <w:lastRenderedPageBreak/>
+        <w:t>3.3.1.</w:t>
+      </w:r>
+      <w:r>
+        <w:rPr>
+          <w:noProof/>
+        </w:rPr>
+        <w:t>3</w:t>
+      </w:r>
+      <w:r>
+        <w:rPr>
+          <w:noProof/>
+        </w:rPr>
+        <w:t xml:space="preserve"> </w:t>
+      </w:r>
+      <w:r>
+        <w:rPr>
+          <w:noProof/>
+        </w:rPr>
+        <w:t>64</w:t>
+      </w:r>
+      <w:r>
+        <w:rPr>
+          <w:noProof/>
+        </w:rPr>
+        <w:t>x</w:t>
+      </w:r>
+      <w:r>
+        <w:rPr>
+          <w:noProof/>
+        </w:rPr>
+        <w:t>64</w:t>
+      </w:r>
+      <w:r>
+        <w:rPr>
+          <w:noProof/>
+        </w:rPr>
+        <w:t xml:space="preserve"> Block Size</w:t>
+      </w:r>
+    </w:p>
+    <w:p>
+      <w:r>
+        <w:rPr>
+          <w:noProof/>
+        </w:rPr>
+        <w:drawing>
+          <wp:inline distT="0" distB="0" distL="0" distR="0" wp14:anchorId="44E5892F" wp14:editId="0C9215E5">
+            <wp:extent cx="5943600" cy="5018405"/>
+            <wp:effectExtent l="0" t="0" r="0" b="0"/>
+            <wp:docPr id="1429458083" name="Picture 5"/>
+            <wp:cNvGraphicFramePr>
+              <a:graphicFrameLocks xmlns:a="http://schemas.openxmlformats.org/drawingml/2006/main" noChangeAspect="1"/>
+            </wp:cNvGraphicFramePr>
+            <a:graphic xmlns:a="http://schemas.openxmlformats.org/drawingml/2006/main">
+              <a:graphicData uri="http://schemas.openxmlformats.org/drawingml/2006/picture">
+                <pic:pic xmlns:pic="http://schemas.openxmlformats.org/drawingml/2006/picture">
+                  <pic:nvPicPr>
+                    <pic:cNvPr id="1429458083" name="Picture 1429458083"/>
+                    <pic:cNvPicPr/>
+                  </pic:nvPicPr>
+                  <pic:blipFill>
+                    <a:blip r:embed="rId14">
+                      <a:extLst>
+                        <a:ext uri="{28A0092B-C50C-407E-A947-70E740481C1C}">
+                          <a14:useLocalDpi xmlns:a14="http://schemas.microsoft.com/office/drawing/2010/main" val="0"/>
+                        </a:ext>
+                      </a:extLst>
+                    </a:blip>
+                    <a:stretch>
+                      <a:fillRect/>
+                    </a:stretch>
+                  </pic:blipFill>
+                  <pic:spPr>
+                    <a:xfrm>
+                      <a:off x="0" y="0"/>
+                      <a:ext cx="5943600" cy="5018405"/>
+                    </a:xfrm>
+                    <a:prstGeom prst="rect">
+                      <a:avLst/>
+                    </a:prstGeom>
+                  </pic:spPr>
+                </pic:pic>
+              </a:graphicData>
+            </a:graphic>
+          </wp:inline>
+        </w:drawing>
+      </w:r>
+    </w:p>
+    <w:p>
+      <w:pPr>
+        <w:pStyle w:val="NoSpacing"/>
+      </w:pPr>
+    </w:p>
+    <w:p>
+      <w:pPr>
+        <w:pStyle w:val="Heading3"/>
+        <w:rPr>
+          <w:noProof/>
+        </w:rPr>
+      </w:pPr>
+      <w:r>
+        <w:rPr>
+          <w:noProof/>
+        </w:rPr>
+        <w:lastRenderedPageBreak/>
+        <w:t>3.3.1.</w:t>
+      </w:r>
+      <w:r>
+        <w:rPr>
+          <w:noProof/>
+        </w:rPr>
+        <w:t>4 128</w:t>
+      </w:r>
+      <w:r>
+        <w:rPr>
+          <w:noProof/>
+        </w:rPr>
+        <w:t>x</w:t>
+      </w:r>
+      <w:r>
+        <w:rPr>
+          <w:noProof/>
+        </w:rPr>
+        <w:t>128</w:t>
+      </w:r>
+      <w:r>
+        <w:rPr>
+          <w:noProof/>
+        </w:rPr>
+        <w:t xml:space="preserve"> Block Size</w:t>
+      </w:r>
+    </w:p>
+    <w:p>
+      <w:pPr>
+        <w:pStyle w:val="NoSpacing"/>
+      </w:pPr>
+      <w:r>
+        <w:rPr>
+          <w:noProof/>
+        </w:rPr>
+        <w:drawing>
+          <wp:inline distT="0" distB="0" distL="0" distR="0" wp14:anchorId="3DDF5683" wp14:editId="04ADB688">
+            <wp:extent cx="5943600" cy="4797425"/>
+            <wp:effectExtent l="0" t="0" r="0" b="3175"/>
+            <wp:docPr id="1497216691" name="Picture 6"/>
+            <wp:cNvGraphicFramePr>
+              <a:graphicFrameLocks xmlns:a="http://schemas.openxmlformats.org/drawingml/2006/main" noChangeAspect="1"/>
+            </wp:cNvGraphicFramePr>
+            <a:graphic xmlns:a="http://schemas.openxmlformats.org/drawingml/2006/main">
+              <a:graphicData uri="http://schemas.openxmlformats.org/drawingml/2006/picture">
+                <pic:pic xmlns:pic="http://schemas.openxmlformats.org/drawingml/2006/picture">
+                  <pic:nvPicPr>
+                    <pic:cNvPr id="1497216691" name="Picture 1497216691"/>
+                    <pic:cNvPicPr/>
+                  </pic:nvPicPr>
+                  <pic:blipFill>
+                    <a:blip r:embed="rId15">
+                      <a:extLst>
+                        <a:ext uri="{28A0092B-C50C-407E-A947-70E740481C1C}">
+                          <a14:useLocalDpi xmlns:a14="http://schemas.microsoft.com/office/drawing/2010/main" val="0"/>
+                        </a:ext>
+                      </a:extLst>
+                    </a:blip>
+                    <a:stretch>
+                      <a:fillRect/>
+                    </a:stretch>
+                  </pic:blipFill>
+                  <pic:spPr>
+                    <a:xfrm>
+                      <a:off x="0" y="0"/>
+                      <a:ext cx="5943600" cy="4797425"/>
+                    </a:xfrm>
+                    <a:prstGeom prst="rect">
+                      <a:avLst/>
+                    </a:prstGeom>
+                  </pic:spPr>
+                </pic:pic>
+              </a:graphicData>
+            </a:graphic>
+          </wp:inline>
+        </w:drawing>
+      </w:r>
+    </w:p>
+    <w:p>
+      <w:pPr>
+        <w:pStyle w:val="NoSpacing"/>
+      </w:pPr>
+    </w:p>
+    <w:p>
+      <w:pPr>
+        <w:pStyle w:val="Heading3"/>
+        <w:rPr>
+          <w:noProof/>
+        </w:rPr>
+      </w:pPr>
+      <w:r>
+        <w:rPr>
+          <w:noProof/>
+        </w:rPr>
+        <w:lastRenderedPageBreak/>
+        <w:t>3.3.1.</w:t>
+      </w:r>
+      <w:r>
+        <w:rPr>
+          <w:noProof/>
+        </w:rPr>
+        <w:t>5</w:t>
+      </w:r>
+      <w:r>
+        <w:rPr>
+          <w:noProof/>
+        </w:rPr>
+        <w:t xml:space="preserve"> </w:t>
+      </w:r>
+      <w:r>
+        <w:rPr>
+          <w:noProof/>
+        </w:rPr>
+        <w:t>256</w:t>
+      </w:r>
+      <w:r>
+        <w:rPr>
+          <w:noProof/>
+        </w:rPr>
+        <w:t>x</w:t>
+      </w:r>
+      <w:r>
+        <w:rPr>
+          <w:noProof/>
+        </w:rPr>
+        <w:t>256</w:t>
+      </w:r>
+      <w:r>
+        <w:rPr>
+          <w:noProof/>
+        </w:rPr>
+        <w:t xml:space="preserve"> Block Size</w:t>
+      </w:r>
+    </w:p>
+    <w:p>
+      <w:pPr>
+        <w:pStyle w:val="NoSpacing"/>
+      </w:pPr>
+      <w:r>
+        <w:rPr>
+          <w:noProof/>
+        </w:rPr>
+        <w:drawing>
+          <wp:inline distT="0" distB="0" distL="0" distR="0" wp14:anchorId="154BEBD8" wp14:editId="0A30E84A">
+            <wp:extent cx="5943600" cy="4893945"/>
+            <wp:effectExtent l="0" t="0" r="0" b="0"/>
+            <wp:docPr id="1105949268" name="Picture 8"/>
+            <wp:cNvGraphicFramePr>
+              <a:graphicFrameLocks xmlns:a="http://schemas.openxmlformats.org/drawingml/2006/main" noChangeAspect="1"/>
+            </wp:cNvGraphicFramePr>
+            <a:graphic xmlns:a="http://schemas.openxmlformats.org/drawingml/2006/main">
+              <a:graphicData uri="http://schemas.openxmlformats.org/drawingml/2006/picture">
+                <pic:pic xmlns:pic="http://schemas.openxmlformats.org/drawingml/2006/picture">
+                  <pic:nvPicPr>
+                    <pic:cNvPr id="1105949268" name="Picture 1105949268"/>
+                    <pic:cNvPicPr/>
+                  </pic:nvPicPr>
+                  <pic:blipFill>
+                    <a:blip r:embed="rId16">
+                      <a:extLst>
+                        <a:ext uri="{28A0092B-C50C-407E-A947-70E740481C1C}">
+                          <a14:useLocalDpi xmlns:a14="http://schemas.microsoft.com/office/drawing/2010/main" val="0"/>
+                        </a:ext>
+                      </a:extLst>
+                    </a:blip>
+                    <a:stretch>
+                      <a:fillRect/>
+                    </a:stretch>
+                  </pic:blipFill>
+                  <pic:spPr>
+                    <a:xfrm>
+                      <a:off x="0" y="0"/>
+                      <a:ext cx="5943600" cy="4893945"/>
+                    </a:xfrm>
+                    <a:prstGeom prst="rect">
+                      <a:avLst/>
+                    </a:prstGeom>
+                  </pic:spPr>
+                </pic:pic>
+              </a:graphicData>
+            </a:graphic>
+          </wp:inline>
+        </w:drawing>
+      </w:r>
+    </w:p>
+    <w:p>
+      <w:pPr>
+        <w:pStyle w:val="Heading3"/>
+      </w:pPr>
+      <w:r>
+        <w:lastRenderedPageBreak/>
+        <w:t>3.3.1.</w:t>
+      </w:r>
+      <w:r>
+        <w:t>6</w:t>
+      </w:r>
+      <w:r>
+        <w:t xml:space="preserve"> </w:t>
+      </w:r>
+      <w:r>
+        <w:t>512x512</w:t>
+      </w:r>
+      <w:r>
+        <w:t xml:space="preserve"> Block Size</w:t>
+      </w:r>
+    </w:p>
+    <w:p>
+      <w:pPr>
+        <w:pStyle w:val="NoSpacing"/>
+      </w:pPr>
+      <w:r>
+        <w:rPr>
+          <w:noProof/>
+        </w:rPr>
+        <w:drawing>
+          <wp:inline distT="0" distB="0" distL="0" distR="0" wp14:anchorId="3886FD56" wp14:editId="05E45314">
+            <wp:extent cx="4434447" cy="4296792"/>
+            <wp:effectExtent l="0" t="0" r="0" b="0"/>
+            <wp:docPr id="571156072" name="Picture 10"/>
+            <wp:cNvGraphicFramePr>
+              <a:graphicFrameLocks xmlns:a="http://schemas.openxmlformats.org/drawingml/2006/main" noChangeAspect="1"/>
+            </wp:cNvGraphicFramePr>
+            <a:graphic xmlns:a="http://schemas.openxmlformats.org/drawingml/2006/main">
+              <a:graphicData uri="http://schemas.openxmlformats.org/drawingml/2006/picture">
+                <pic:pic xmlns:pic="http://schemas.openxmlformats.org/drawingml/2006/picture">
+                  <pic:nvPicPr>
+                    <pic:cNvPr id="571156072" name="Picture 571156072"/>
+                    <pic:cNvPicPr/>
+                  </pic:nvPicPr>
+                  <pic:blipFill>
+                    <a:blip r:embed="rId17">
+                      <a:extLst>
+                        <a:ext uri="{28A0092B-C50C-407E-A947-70E740481C1C}">
+                          <a14:useLocalDpi xmlns:a14="http://schemas.microsoft.com/office/drawing/2010/main" val="0"/>
+                        </a:ext>
+                      </a:extLst>
+                    </a:blip>
+                    <a:stretch>
+                      <a:fillRect/>
+                    </a:stretch>
+                  </pic:blipFill>
+                  <pic:spPr>
+                    <a:xfrm>
+                      <a:off x="0" y="0"/>
+                      <a:ext cx="4436011" cy="4298307"/>
+                    </a:xfrm>
+                    <a:prstGeom prst="rect">
+                      <a:avLst/>
+                    </a:prstGeom>
+                  </pic:spPr>
+                </pic:pic>
+              </a:graphicData>
+            </a:graphic>
+          </wp:inline>
+        </w:drawing>
+      </w:r>
+    </w:p>
+    <w:p>
+      <w:pPr>
+        <w:pStyle w:val="Heading3"/>
+        <w:rPr>
+          <w:noProof/>
+        </w:rPr>
+      </w:pPr>
+      <w:r>
+        <w:rPr>
+          <w:noProof/>
+        </w:rPr>
+        <w:lastRenderedPageBreak/>
+        <w:t>3.3.1.</w:t>
+      </w:r>
+      <w:r>
+        <w:rPr>
+          <w:noProof/>
+        </w:rPr>
+        <w:t>7</w:t>
+      </w:r>
+      <w:r>
+        <w:rPr>
+          <w:noProof/>
+        </w:rPr>
+        <w:t xml:space="preserve"> </w:t>
+      </w:r>
+      <w:r>
+        <w:rPr>
+          <w:noProof/>
+        </w:rPr>
+        <w:t xml:space="preserve">1024x1024 </w:t>
+      </w:r>
+      <w:r>
+        <w:rPr>
+          <w:noProof/>
+        </w:rPr>
+        <w:t>Block Size</w:t>
+      </w:r>
+    </w:p>
+    <w:p>
+      <w:pPr>
+        <w:pStyle w:val="NoSpacing"/>
+      </w:pPr>
+      <w:r>
+        <w:rPr>
+          <w:noProof/>
+        </w:rPr>
+        <w:drawing>
+          <wp:inline distT="0" distB="0" distL="0" distR="0" wp14:anchorId="2B054F57" wp14:editId="6B4B8C66">
+            <wp:extent cx="5829300" cy="6007100"/>
+            <wp:effectExtent l="0" t="0" r="0" b="0"/>
+            <wp:docPr id="781576684" name="Picture 9"/>
+            <wp:cNvGraphicFramePr>
+              <a:graphicFrameLocks xmlns:a="http://schemas.openxmlformats.org/drawingml/2006/main" noChangeAspect="1"/>
+            </wp:cNvGraphicFramePr>
+            <a:graphic xmlns:a="http://schemas.openxmlformats.org/drawingml/2006/main">
+              <a:graphicData uri="http://schemas.openxmlformats.org/drawingml/2006/picture">
+                <pic:pic xmlns:pic="http://schemas.openxmlformats.org/drawingml/2006/picture">
+                  <pic:nvPicPr>
+                    <pic:cNvPr id="781576684" name="Picture 781576684"/>
+                    <pic:cNvPicPr/>
+                  </pic:nvPicPr>
+                  <pic:blipFill>
+                    <a:blip r:embed="rId18">
+                      <a:extLst>
+                        <a:ext uri="{28A0092B-C50C-407E-A947-70E740481C1C}">
+                          <a14:useLocalDpi xmlns:a14="http://schemas.microsoft.com/office/drawing/2010/main" val="0"/>
+                        </a:ext>
+                      </a:extLst>
+                    </a:blip>
+                    <a:stretch>
+                      <a:fillRect/>
+                    </a:stretch>
+                  </pic:blipFill>
+                  <pic:spPr>
+                    <a:xfrm>
+                      <a:off x="0" y="0"/>
+                      <a:ext cx="5829300" cy="6007100"/>
+                    </a:xfrm>
+                    <a:prstGeom prst="rect">
+                      <a:avLst/>
+                    </a:prstGeom>
+                  </pic:spPr>
+                </pic:pic>
+              </a:graphicData>
+            </a:graphic>
+          </wp:inline>
+        </w:drawing>
+      </w:r>
+    </w:p>
+    <w:p>
+      <w:pPr>
+        <w:pStyle w:val="Heading3"/>
+      </w:pPr>
+    </w:p>
+    <w:p>
+      <w:pPr>
+        <w:pStyle w:val="Heading3"/>
+        <w:rPr>
+          <w:noProof/>
+        </w:rPr>
+      </w:pPr>
+      <w:r>
+        <w:t>3.3.1 Neon Block Matrix Multiplication</w:t>
+      </w:r>
+      <w:r>
+        <w:rPr>
+          <w:noProof/>
+        </w:rPr>
+        <w:t xml:space="preserve"> `time make </w:t>
+      </w:r>
+      <w:r>
+        <w:rPr>
+          <w:noProof/>
+        </w:rPr>
+        <w:t>benchmark</w:t>
+      </w:r>
+      <w:r>
+        <w:rPr>
+          <w:noProof/>
+        </w:rPr>
+        <w:t>` output</w:t>
+      </w:r>
+      <w:r>
+        <w:rPr>
+          <w:noProof/>
+        </w:rPr>
+        <w:t xml:space="preserve"> (32x32 block)</w:t>
+      </w:r>
+    </w:p>
+    <w:p>
+      <w:pPr>
+        <w:pStyle w:val="NoSpacing"/>
+      </w:pPr>
+      <w:r>
+        <w:rPr>
+          <w:noProof/>
+        </w:rPr>
+        <w:drawing>
+          <wp:inline distT="0" distB="0" distL="0" distR="0" wp14:anchorId="6E9A8DD0" wp14:editId="22994EF2">
+            <wp:extent cx="2975618" cy="5051394"/>
+            <wp:effectExtent l="0" t="0" r="0" b="3810"/>
+            <wp:docPr id="2090015608" name="Picture 2"/>
+            <wp:cNvGraphicFramePr>
+              <a:graphicFrameLocks xmlns:a="http://schemas.openxmlformats.org/drawingml/2006/main" noChangeAspect="1"/>
+            </wp:cNvGraphicFramePr>
+            <a:graphic xmlns:a="http://schemas.openxmlformats.org/drawingml/2006/main">
+              <a:graphicData uri="http://schemas.openxmlformats.org/drawingml/2006/picture">
+                <pic:pic xmlns:pic="http://schemas.openxmlformats.org/drawingml/2006/picture">
+                  <pic:nvPicPr>
+                    <pic:cNvPr id="2090015608" name="Picture 2090015608"/>
+                    <pic:cNvPicPr/>
+                  </pic:nvPicPr>
+                  <pic:blipFill>
+                    <a:blip r:embed="rId19">
+                      <a:extLst>
+                        <a:ext uri="{28A0092B-C50C-407E-A947-70E740481C1C}">
+                          <a14:useLocalDpi xmlns:a14="http://schemas.microsoft.com/office/drawing/2010/main" val="0"/>
+                        </a:ext>
+                      </a:extLst>
+                    </a:blip>
+                    <a:stretch>
+                      <a:fillRect/>
+                    </a:stretch>
+                  </pic:blipFill>
+                  <pic:spPr>
+                    <a:xfrm>
+                      <a:off x="0" y="0"/>
+                      <a:ext cx="3010972" cy="5111410"/>
+                    </a:xfrm>
+                    <a:prstGeom prst="rect">
+                      <a:avLst/>
+                    </a:prstGeom>
+                  </pic:spPr>
+                </pic:pic>
+              </a:graphicData>
+            </a:graphic>
+          </wp:inline>
+        </w:drawing>
+      </w:r>
+    </w:p>
+    <w:p>
+      <w:pPr>
+        <w:pStyle w:val="NoSpacing"/>
+      </w:pPr>
+    </w:p>
+    <w:p>
+      <w:r>
+        <w:t xml:space="preserve">The OpenCL GPU implementation has the highest startup latency because it must create OpenCL resources, transfer the matrices, launch the kernel, and copy the result back to the CPU. However, it can provide the highest throughput for large matrices because many output elements are calculated in parallel. </w:t>
+      </w:r>
+    </w:p>
+    <w:p>
+      <w:r>
+        <w:t xml:space="preserve">NEON has lower latency because it uses SIMD instructions directly on the CPU and does not require GPU kernel launches or memory transfers. It is often a good choice for small-to-medium matrices or latency-sensitive applications. </w:t>
+      </w:r>
+    </w:p>
+    <w:p>
+      <w:r>
+        <w:lastRenderedPageBreak/>
+        <w:t>Plain CPU code has the least setup overhead but performs fewer calculations in parallel, making it suitable for very small matrices where GPU or SIMD overhead would provide little benefit. Therefore, plain CPU code may be preferable for very small workloads, NEON for small-to-medium workloads, and OpenCL for large matrices or batches of matrices.</w:t>
+      </w:r>
+    </w:p>
+    <w:p/>
+    <w:p/>
+    <w:p/>
+    <w:p/>
+    <w:p>
+      <w:pPr>
+        <w:pStyle w:val="Heading1"/>
+      </w:pPr>
+    </w:p>
+    <w:p>
+      <w:pPr>
+        <w:pStyle w:val="Heading1"/>
+      </w:pPr>
+    </w:p>
+    <w:p>
+      <w:pPr>
+        <w:pStyle w:val="Heading1"/>
+      </w:pPr>
+    </w:p>
+    <w:p>
+      <w:pPr>
+        <w:pStyle w:val="Heading1"/>
+      </w:pPr>
+    </w:p>
+    <w:p>
+      <w:pPr>
+        <w:pStyle w:val="Heading1"/>
+      </w:pPr>
+    </w:p>
+    <w:p>
+      <w:pPr>
+        <w:pStyle w:val="Heading1"/>
+      </w:pPr>
+    </w:p>
+    <w:p>
+      <w:pPr>
+        <w:pStyle w:val="Heading1"/>
+      </w:pPr>
+    </w:p>
+    <w:p/>
+    <w:p/>
+    <w:p/>
+    <w:p/>
+    <w:p/>
+    <w:p/>
+    <w:sdt>
+      <w:sdtPr>
+        <w:rPr>
+          <w:rFonts w:asciiTheme="minorHAnsi" w:eastAsiaTheme="minorHAnsi" w:hAnsiTheme="minorHAnsi" w:cstheme="minorBidi"/>
+          <w:color w:val="auto"/>
+          <w:sz w:val="24"/>
+          <w:szCs w:val="24"/>
+        </w:rPr>
+        <w:id w:val="1791628828"/>
+        <w:docPartObj>
+          <w:docPartGallery w:val="Bibliographies"/>
+          <w:docPartUnique/>
+        </w:docPartObj>
+      </w:sdtPr>
+      <w:sdtEndPr>
+        <w:rPr>
+          <w:b/>
+          <w:bCs/>
+        </w:rPr>
+      </w:sdtEndPr>
+      <w:sdtContent>
+        <w:p>
+          <w:pPr>
+            <w:pStyle w:val="Heading1"/>
+          </w:pPr>
+          <w:r>
+            <w:t>Works Cited</w:t>
+          </w:r>
+        </w:p>
+        <w:p>
+          <w:pPr>
+            <w:rPr>
+              <w:noProof/>
+            </w:rPr>
+          </w:pPr>
+          <w:r>
+            <w:fldChar w:fldCharType="begin"/>
+          </w:r>
+          <w:r>
+            <w:instrText xml:space="preserve"> BIBLIOGRAPHY </w:instrText>
+          </w:r>
+          <w:r>
+            <w:fldChar w:fldCharType="separate"/>
+          </w:r>
+        </w:p>
+        <w:tbl>
+          <w:tblPr>
+            <w:tblW w:w="5000" w:type="pct"/>
+            <w:tblCellSpacing w:w="15" w:type="dxa"/>
+            <w:tblCellMar>
+              <w:top w:w="15" w:type="dxa"/>
+              <w:left w:w="15" w:type="dxa"/>
+              <w:bottom w:w="15" w:type="dxa"/>
+              <w:right w:w="15" w:type="dxa"/>
+            </w:tblCellMar>
+            <w:tblLook w:val="04A0" w:firstRow="1" w:lastRow="0" w:firstColumn="1" w:lastColumn="0" w:noHBand="0" w:noVBand="1"/>
+          </w:tblPr>
+          <w:tblGrid>
+            <w:gridCol w:w="345"/>
+            <w:gridCol w:w="9015"/>
+          </w:tblGrid>
+          <w:tr>
+            <w:trPr>
+              <w:divId w:val="418066537"/>
+              <w:tblCellSpacing w:w="15" w:type="dxa"/>
+            </w:trPr>
+            <w:tc>
+              <w:tcPr>
+                <w:tcW w:w="50" w:type="pct"/>
+                <w:hideMark/>
+              </w:tcPr>
+              <w:p>
+                <w:pPr>
+                  <w:pStyle w:val="Bibliography"/>
+                  <w:rPr>
+                    <w:noProof/>
+                    <w:kern w:val="0"/>
+                    <w14:ligatures w14:val="none"/>
+                  </w:rPr>
+                </w:pPr>
+                <w:r>
+                  <w:rPr>
+                    <w:noProof/>
+                  </w:rPr>
+                  <w:t xml:space="preserve">[1] </w:t>
+                </w:r>
+              </w:p>
+            </w:tc>
+            <w:tc>
+              <w:tcPr>
+                <w:tcW w:w="0" w:type="auto"/>
+                <w:hideMark/>
+              </w:tcPr>
+              <w:p>
+                <w:pPr>
+                  <w:pStyle w:val="Bibliography"/>
+                  <w:rPr>
+                    <w:noProof/>
+                  </w:rPr>
+                </w:pPr>
+                <w:r>
+                  <w:rPr>
+                    <w:noProof/>
+                  </w:rPr>
+                  <w:t>V. Blanco, "Intro to Practical SIMD for Graphics," [Online]. Available: https://vkguide.dev/docs/extra-chapter/intro_to_simd/.</w:t>
+                </w:r>
+              </w:p>
+            </w:tc>
+          </w:tr>
+          <w:tr>
+            <w:trPr>
+              <w:divId w:val="418066537"/>
+              <w:tblCellSpacing w:w="15" w:type="dxa"/>
+            </w:trPr>
+            <w:tc>
+              <w:tcPr>
+                <w:tcW w:w="50" w:type="pct"/>
+                <w:hideMark/>
+              </w:tcPr>
+              <w:p>
+                <w:pPr>
+                  <w:pStyle w:val="Bibliography"/>
+                  <w:rPr>
+                    <w:noProof/>
+                  </w:rPr>
+                </w:pPr>
+                <w:r>
+                  <w:rPr>
+                    <w:noProof/>
+                  </w:rPr>
+                  <w:t xml:space="preserve">[2] </w:t>
+                </w:r>
+              </w:p>
+            </w:tc>
+            <w:tc>
+              <w:tcPr>
+                <w:tcW w:w="0" w:type="auto"/>
+                <w:hideMark/>
+              </w:tcPr>
+              <w:p>
+                <w:pPr>
+                  <w:pStyle w:val="Bibliography"/>
+                  <w:rPr>
+                    <w:noProof/>
+                  </w:rPr>
+                </w:pPr>
+                <w:r>
+                  <w:rPr>
+                    <w:noProof/>
+                  </w:rPr>
+                  <w:t>ARM, "Getting Started with Neon Intrinsics on Android," [Online]. Available: https://www.arm.com/technologies/neon.</w:t>
+                </w:r>
+              </w:p>
+            </w:tc>
+          </w:tr>
+          <w:tr>
+            <w:trPr>
+              <w:divId w:val="418066537"/>
+              <w:tblCellSpacing w:w="15" w:type="dxa"/>
+            </w:trPr>
+            <w:tc>
+              <w:tcPr>
+                <w:tcW w:w="50" w:type="pct"/>
+                <w:hideMark/>
+              </w:tcPr>
+              <w:p>
+                <w:pPr>
+                  <w:pStyle w:val="Bibliography"/>
+                  <w:rPr>
+                    <w:noProof/>
+                  </w:rPr>
+                </w:pPr>
+                <w:r>
+                  <w:rPr>
+                    <w:noProof/>
+                  </w:rPr>
+                  <w:t xml:space="preserve">[3] </w:t>
+                </w:r>
+              </w:p>
+            </w:tc>
+            <w:tc>
+              <w:tcPr>
+                <w:tcW w:w="0" w:type="auto"/>
+                <w:hideMark/>
+              </w:tcPr>
+              <w:p>
+                <w:pPr>
+                  <w:pStyle w:val="Bibliography"/>
+                  <w:rPr>
+                    <w:noProof/>
+                  </w:rPr>
+                </w:pPr>
+                <w:r>
+                  <w:rPr>
+                    <w:noProof/>
+                  </w:rPr>
+                  <w:t>ARM, "Intrinsics," [Online]. Available: https://developer.arm.com/architectures/instruction-sets/intrinsics/#f:@navigationhierarchiessimdisa=[Neon]&amp;q=vaddvq_s32.</w:t>
+                </w:r>
+              </w:p>
+            </w:tc>
+          </w:tr>
+          <w:tr>
+            <w:trPr>
+              <w:divId w:val="418066537"/>
+              <w:tblCellSpacing w:w="15" w:type="dxa"/>
+            </w:trPr>
+            <w:tc>
+              <w:tcPr>
+                <w:tcW w:w="50" w:type="pct"/>
+                <w:hideMark/>
+              </w:tcPr>
+              <w:p>
+                <w:pPr>
+                  <w:pStyle w:val="Bibliography"/>
+                  <w:rPr>
+                    <w:noProof/>
+                  </w:rPr>
+                </w:pPr>
+                <w:r>
+                  <w:rPr>
+                    <w:noProof/>
+                  </w:rPr>
+                  <w:t xml:space="preserve">[4] </w:t>
+                </w:r>
+              </w:p>
+            </w:tc>
+            <w:tc>
+              <w:tcPr>
+                <w:tcW w:w="0" w:type="auto"/>
+                <w:hideMark/>
+              </w:tcPr>
+              <w:p>
+                <w:pPr>
+                  <w:pStyle w:val="Bibliography"/>
+                  <w:rPr>
+                    <w:noProof/>
+                  </w:rPr>
+                </w:pPr>
+                <w:r>
+                  <w:rPr>
+                    <w:noProof/>
+                  </w:rPr>
+                  <w:t>Microsoft, "ARM intrinsics," [Online]. Available: https://learn.microsoft.com/en-us/cpp/intrinsics/arm-intrinsics?view=msvc-170.</w:t>
+                </w:r>
+              </w:p>
+            </w:tc>
+          </w:tr>
+        </w:tbl>
+        <w:p>
+          <w:pPr>
+            <w:divId w:val="418066537"/>
+            <w:rPr>
+              <w:rFonts w:eastAsia="Times New Roman"/>
+              <w:noProof/>
+            </w:rPr>
+          </w:pPr>
+        </w:p>
+        <w:p>
+          <w:r>
+            <w:rPr>
+              <w:b/>
+              <w:bCs/>
+            </w:rPr>
+            <w:fldChar w:fldCharType="end"/>
+          </w:r>
+        </w:p>
+      </w:sdtContent>
+    </w:sdt>
+    <w:p/>
     <w:sectPr>
       <w:pgSz w:w="12240" w:h="15840"/>
       <w:pgMar w:top="1440" w:right="1440" w:bottom="1440" w:left="1440" w:header="720" w:footer="720" w:gutter="0"/>
@@ -42,6 +3276,100 @@
     </w:sectPr>
   </w:body>
 </w:document>
+</file>
+
+<file path=word/numbering.xml><?xml version="1.0" encoding="utf-8"?>
+<w:numbering xmlns:wpc="http://schemas.microsoft.com/office/word/2010/wordprocessingCanvas" xmlns:cx="http://schemas.microsoft.com/office/drawing/2014/chartex" xmlns:cx1="http://schemas.microsoft.com/office/drawing/2015/9/8/chartex" xmlns:cx2="http://schemas.microsoft.com/office/drawing/2015/10/21/chartex" xmlns:cx3="http://schemas.microsoft.com/office/drawing/2016/5/9/chartex" xmlns:cx4="http://schemas.microsoft.com/office/drawing/2016/5/10/chartex" xmlns:cx5="http://schemas.microsoft.com/office/drawing/2016/5/11/chartex" xmlns:cx6="http://schemas.microsoft.com/office/drawing/2016/5/12/chartex" xmlns:cx7="http://schemas.microsoft.com/office/drawing/2016/5/13/chartex" xmlns:cx8="http://schemas.microsoft.com/office/drawing/2016/5/14/chartex" xmlns:mc="http://schemas.openxmlformats.org/markup-compatibility/2006" xmlns:m="http://schemas.openxmlformats.org/officeDocument/2006/math" xmlns:aink="http://schemas.microsoft.com/office/drawing/2016/ink" xmlns:am3d="http://schemas.microsoft.com/office/drawing/2017/model3d" xmlns:oel="http://schemas.microsoft.com/office/2019/extlst" xmlns:r="http://schemas.openxmlformats.org/officeDocument/2006/relationships" xmlns:wp14="http://schemas.microsoft.com/office/word/2010/wordprocessingDrawing" xmlns:wp="http://schemas.openxmlformats.org/drawingml/2006/wordprocessingDrawing" xmlns:wpg="http://schemas.microsoft.com/office/word/2010/wordprocessingGroup" xmlns:wpi="http://schemas.microsoft.com/office/word/2010/wordprocessingInk" xmlns:wps="http://schemas.microsoft.com/office/word/2010/wordprocessingShape" xmlns:o="urn:schemas-microsoft-com:office:office" xmlns:v="urn:schemas-microsoft-com:vml" xmlns:w10="urn:schemas-microsoft-com:office:word" xmlns:w="http://schemas.openxmlformats.org/wordprocessingml/2006/main" xmlns:w14="http://schemas.microsoft.com/office/word/2010/wordml" xmlns:w15="http://schemas.microsoft.com/office/word/2012/wordml" xmlns:w16cei="http://schemas.microsoft.com/office/word/2026/wordml/cei" xmlns:w16cex="http://schemas.microsoft.com/office/word/2018/wordml/cex" xmlns:w16cid="http://schemas.microsoft.com/office/word/2016/wordml/cid" xmlns:w16="http://schemas.microsoft.com/office/word/2018/wordml" xmlns:w16sdtdh="http://schemas.microsoft.com/office/word/2020/wordml/sdtdatahash" xmlns:w16sdtfl="http://schemas.microsoft.com/office/word/2024/wordml/sdtformatlock" xmlns:w16se="http://schemas.microsoft.com/office/word/2015/wordml/symex" xmlns:w16du="http://schemas.microsoft.com/office/word/2023/wordml/word16du" xmlns:wne="http://schemas.microsoft.com/office/word/2006/wordml" mc:Ignorable="w14 w15 w16se w16cid w16 w16cex w16sdtdh w16sdtfl w16du wp14">
+  <w:abstractNum w:abstractNumId="0" w15:restartNumberingAfterBreak="0">
+    <w:nsid w:val="55AE3177"/>
+    <w:multiLevelType w:val="hybridMultilevel"/>
+    <w:tmpl w:val="98DA522E"/>
+    <w:lvl w:ilvl="0" w:tplc="0409000F">
+      <w:start w:val="1"/>
+      <w:numFmt w:val="decimal"/>
+      <w:lvlText w:val="%1."/>
+      <w:lvlJc w:val="left"/>
+      <w:pPr>
+        <w:ind w:left="720" w:hanging="360"/>
+      </w:pPr>
+    </w:lvl>
+    <w:lvl w:ilvl="1" w:tplc="04090019">
+      <w:start w:val="1"/>
+      <w:numFmt w:val="lowerLetter"/>
+      <w:lvlText w:val="%2."/>
+      <w:lvlJc w:val="left"/>
+      <w:pPr>
+        <w:ind w:left="1440" w:hanging="360"/>
+      </w:pPr>
+    </w:lvl>
+    <w:lvl w:ilvl="2" w:tplc="0409001B" w:tentative="1">
+      <w:start w:val="1"/>
+      <w:numFmt w:val="lowerRoman"/>
+      <w:lvlText w:val="%3."/>
+      <w:lvlJc w:val="right"/>
+      <w:pPr>
+        <w:ind w:left="2160" w:hanging="180"/>
+      </w:pPr>
+    </w:lvl>
+    <w:lvl w:ilvl="3" w:tplc="0409000F" w:tentative="1">
+      <w:start w:val="1"/>
+      <w:numFmt w:val="decimal"/>
+      <w:lvlText w:val="%4."/>
+      <w:lvlJc w:val="left"/>
+      <w:pPr>
+        <w:ind w:left="2880" w:hanging="360"/>
+      </w:pPr>
+    </w:lvl>
+    <w:lvl w:ilvl="4" w:tplc="04090019" w:tentative="1">
+      <w:start w:val="1"/>
+      <w:numFmt w:val="lowerLetter"/>
+      <w:lvlText w:val="%5."/>
+      <w:lvlJc w:val="left"/>
+      <w:pPr>
+        <w:ind w:left="3600" w:hanging="360"/>
+      </w:pPr>
+    </w:lvl>
+    <w:lvl w:ilvl="5" w:tplc="0409001B" w:tentative="1">
+      <w:start w:val="1"/>
+      <w:numFmt w:val="lowerRoman"/>
+      <w:lvlText w:val="%6."/>
+      <w:lvlJc w:val="right"/>
+      <w:pPr>
+        <w:ind w:left="4320" w:hanging="180"/>
+      </w:pPr>
+    </w:lvl>
+    <w:lvl w:ilvl="6" w:tplc="0409000F" w:tentative="1">
+      <w:start w:val="1"/>
+      <w:numFmt w:val="decimal"/>
+      <w:lvlText w:val="%7."/>
+      <w:lvlJc w:val="left"/>
+      <w:pPr>
+        <w:ind w:left="5040" w:hanging="360"/>
+      </w:pPr>
+    </w:lvl>
+    <w:lvl w:ilvl="7" w:tplc="04090019" w:tentative="1">
+      <w:start w:val="1"/>
+      <w:numFmt w:val="lowerLetter"/>
+      <w:lvlText w:val="%8."/>
+      <w:lvlJc w:val="left"/>
+      <w:pPr>
+        <w:ind w:left="5760" w:hanging="360"/>
+      </w:pPr>
+    </w:lvl>
+    <w:lvl w:ilvl="8" w:tplc="0409001B" w:tentative="1">
+      <w:start w:val="1"/>
+      <w:numFmt w:val="lowerRoman"/>
+      <w:lvlText w:val="%9."/>
+      <w:lvlJc w:val="right"/>
+      <w:pPr>
+        <w:ind w:left="6480" w:hanging="180"/>
+      </w:pPr>
+    </w:lvl>
+  </w:abstractNum>
+  <w:num w:numId="1" w16cid:durableId="684937513">
+    <w:abstractNumId w:val="0"/>
+  </w:num>
+</w:numbering>
 </file>
 
 <file path=word/styles.xml><?xml version="1.0" encoding="utf-8"?>
@@ -494,7 +3822,6 @@
     <w:next w:val="Normal"/>
     <w:link w:val="Heading3Char"/>
     <w:uiPriority w:val="9"/>
-    <w:semiHidden/>
     <w:unhideWhenUsed/>
     <w:qFormat/>
     <w:rsid w:val="005B7E8C"/>
@@ -701,7 +4028,6 @@
     <w:basedOn w:val="DefaultParagraphFont"/>
     <w:link w:val="Heading3"/>
     <w:uiPriority w:val="9"/>
-    <w:semiHidden/>
     <w:rsid w:val="005B7E8C"/>
     <w:rPr>
       <w:rFonts w:eastAsiaTheme="majorEastAsia" w:cstheme="majorBidi"/>
@@ -959,7 +4285,1206 @@
       <w:spacing w:val="5"/>
     </w:rPr>
   </w:style>
+  <w:style w:type="paragraph" w:styleId="Bibliography">
+    <w:name w:val="Bibliography"/>
+    <w:basedOn w:val="Normal"/>
+    <w:next w:val="Normal"/>
+    <w:uiPriority w:val="37"/>
+    <w:unhideWhenUsed/>
+    <w:rsid w:val="00E65E04"/>
+  </w:style>
+  <w:style w:type="paragraph" w:customStyle="1" w:styleId="Style1">
+    <w:name w:val="Style1"/>
+    <w:basedOn w:val="HTMLPreformatted"/>
+    <w:next w:val="Normal"/>
+    <w:link w:val="Style1Char"/>
+    <w:qFormat/>
+    <w:rsid w:val="00334DEA"/>
+  </w:style>
+  <w:style w:type="paragraph" w:styleId="HTMLPreformatted">
+    <w:name w:val="HTML Preformatted"/>
+    <w:basedOn w:val="Normal"/>
+    <w:link w:val="HTMLPreformattedChar"/>
+    <w:uiPriority w:val="99"/>
+    <w:semiHidden/>
+    <w:unhideWhenUsed/>
+    <w:rsid w:val="00334DEA"/>
+    <w:pPr>
+      <w:spacing w:after="0" w:line="240" w:lineRule="auto"/>
+    </w:pPr>
+    <w:rPr>
+      <w:rFonts w:ascii="Consolas" w:hAnsi="Consolas" w:cs="Consolas"/>
+      <w:sz w:val="20"/>
+      <w:szCs w:val="20"/>
+    </w:rPr>
+  </w:style>
+  <w:style w:type="character" w:customStyle="1" w:styleId="HTMLPreformattedChar">
+    <w:name w:val="HTML Preformatted Char"/>
+    <w:basedOn w:val="DefaultParagraphFont"/>
+    <w:link w:val="HTMLPreformatted"/>
+    <w:uiPriority w:val="99"/>
+    <w:semiHidden/>
+    <w:rsid w:val="00334DEA"/>
+    <w:rPr>
+      <w:rFonts w:ascii="Consolas" w:hAnsi="Consolas" w:cs="Consolas"/>
+      <w:sz w:val="20"/>
+      <w:szCs w:val="20"/>
+    </w:rPr>
+  </w:style>
+  <w:style w:type="character" w:styleId="BookTitle">
+    <w:name w:val="Book Title"/>
+    <w:basedOn w:val="DefaultParagraphFont"/>
+    <w:uiPriority w:val="33"/>
+    <w:qFormat/>
+    <w:rsid w:val="00334DEA"/>
+    <w:rPr>
+      <w:b/>
+      <w:bCs/>
+      <w:i/>
+      <w:iCs/>
+      <w:spacing w:val="5"/>
+    </w:rPr>
+  </w:style>
+  <w:style w:type="character" w:customStyle="1" w:styleId="Style1Char">
+    <w:name w:val="Style1 Char"/>
+    <w:basedOn w:val="HTMLPreformattedChar"/>
+    <w:link w:val="Style1"/>
+    <w:rsid w:val="00334DEA"/>
+    <w:rPr>
+      <w:rFonts w:ascii="Consolas" w:hAnsi="Consolas" w:cs="Consolas"/>
+      <w:sz w:val="20"/>
+      <w:szCs w:val="20"/>
+    </w:rPr>
+  </w:style>
+  <w:style w:type="paragraph" w:styleId="NoSpacing">
+    <w:name w:val="No Spacing"/>
+    <w:uiPriority w:val="1"/>
+    <w:qFormat/>
+    <w:rsid w:val="00BA3C2E"/>
+    <w:pPr>
+      <w:spacing w:after="0" w:line="240" w:lineRule="auto"/>
+    </w:pPr>
+  </w:style>
+  <w:style w:type="paragraph" w:customStyle="1" w:styleId="isselectedend">
+    <w:name w:val="isselectedend"/>
+    <w:basedOn w:val="Normal"/>
+    <w:rsid w:val="00252E2E"/>
+    <w:pPr>
+      <w:spacing w:before="100" w:beforeAutospacing="1" w:after="100" w:afterAutospacing="1" w:line="240" w:lineRule="auto"/>
+    </w:pPr>
+    <w:rPr>
+      <w:rFonts w:ascii="Times New Roman" w:eastAsia="Times New Roman" w:hAnsi="Times New Roman" w:cs="Times New Roman"/>
+      <w:kern w:val="0"/>
+      <w14:ligatures w14:val="none"/>
+    </w:rPr>
+  </w:style>
+  <w:style w:type="character" w:styleId="HTMLCode">
+    <w:name w:val="HTML Code"/>
+    <w:basedOn w:val="DefaultParagraphFont"/>
+    <w:uiPriority w:val="99"/>
+    <w:semiHidden/>
+    <w:unhideWhenUsed/>
+    <w:rsid w:val="00252E2E"/>
+    <w:rPr>
+      <w:rFonts w:ascii="Courier New" w:eastAsia="Times New Roman" w:hAnsi="Courier New" w:cs="Courier New"/>
+      <w:sz w:val="20"/>
+      <w:szCs w:val="20"/>
+    </w:rPr>
+  </w:style>
+  <w:style w:type="paragraph" w:styleId="NormalWeb">
+    <w:name w:val="Normal (Web)"/>
+    <w:basedOn w:val="Normal"/>
+    <w:uiPriority w:val="99"/>
+    <w:semiHidden/>
+    <w:unhideWhenUsed/>
+    <w:rsid w:val="00252E2E"/>
+    <w:pPr>
+      <w:spacing w:before="100" w:beforeAutospacing="1" w:after="100" w:afterAutospacing="1" w:line="240" w:lineRule="auto"/>
+    </w:pPr>
+    <w:rPr>
+      <w:rFonts w:ascii="Times New Roman" w:eastAsia="Times New Roman" w:hAnsi="Times New Roman" w:cs="Times New Roman"/>
+      <w:kern w:val="0"/>
+      <w14:ligatures w14:val="none"/>
+    </w:rPr>
+  </w:style>
 </w:styles>
+</file>
+
+<file path=word/charts/chart1.xml><?xml version="1.0" encoding="utf-8"?>
+<c:chartSpace xmlns:c="http://schemas.openxmlformats.org/drawingml/2006/chart" xmlns:a="http://schemas.openxmlformats.org/drawingml/2006/main" xmlns:r="http://schemas.openxmlformats.org/officeDocument/2006/relationships" xmlns:c16r2="http://schemas.microsoft.com/office/drawing/2015/06/chart">
+  <c:date1904 val="0"/>
+  <c:lang val="en-US"/>
+  <c:roundedCorners val="0"/>
+  <mc:AlternateContent xmlns:mc="http://schemas.openxmlformats.org/markup-compatibility/2006">
+    <mc:Choice xmlns:c14="http://schemas.microsoft.com/office/drawing/2007/8/2/chart" Requires="c14">
+      <c14:style val="102"/>
+    </mc:Choice>
+    <mc:Fallback>
+      <c:style val="2"/>
+    </mc:Fallback>
+  </mc:AlternateContent>
+  <c:chart>
+    <c:title>
+      <c:tx>
+        <c:rich>
+          <a:bodyPr rot="0" spcFirstLastPara="1" vertOverflow="ellipsis" vert="horz" wrap="square" anchor="ctr" anchorCtr="1"/>
+          <a:lstStyle/>
+          <a:p>
+            <a:pPr>
+              <a:defRPr sz="1800" b="1" i="0" u="none" strike="noStrike" kern="1200" cap="all" spc="150" baseline="0">
+                <a:solidFill>
+                  <a:schemeClr val="tx1">
+                    <a:lumMod val="50000"/>
+                    <a:lumOff val="50000"/>
+                  </a:schemeClr>
+                </a:solidFill>
+                <a:latin typeface="+mn-lt"/>
+                <a:ea typeface="+mn-ea"/>
+                <a:cs typeface="+mn-cs"/>
+              </a:defRPr>
+            </a:pPr>
+            <a:r>
+              <a:rPr lang="en-US" sz="1800" b="1" i="0" u="none" strike="noStrike" cap="all" baseline="0"/>
+              <a:t>Total Execution Time vs. Block Size</a:t>
+            </a:r>
+            <a:endParaRPr lang="en-US"/>
+          </a:p>
+        </c:rich>
+      </c:tx>
+      <c:overlay val="0"/>
+      <c:spPr>
+        <a:noFill/>
+        <a:ln>
+          <a:noFill/>
+        </a:ln>
+        <a:effectLst/>
+      </c:spPr>
+      <c:txPr>
+        <a:bodyPr rot="0" spcFirstLastPara="1" vertOverflow="ellipsis" vert="horz" wrap="square" anchor="ctr" anchorCtr="1"/>
+        <a:lstStyle/>
+        <a:p>
+          <a:pPr>
+            <a:defRPr sz="1800" b="1" i="0" u="none" strike="noStrike" kern="1200" cap="all" spc="150" baseline="0">
+              <a:solidFill>
+                <a:schemeClr val="tx1">
+                  <a:lumMod val="50000"/>
+                  <a:lumOff val="50000"/>
+                </a:schemeClr>
+              </a:solidFill>
+              <a:latin typeface="+mn-lt"/>
+              <a:ea typeface="+mn-ea"/>
+              <a:cs typeface="+mn-cs"/>
+            </a:defRPr>
+          </a:pPr>
+          <a:endParaRPr lang="en-US"/>
+        </a:p>
+      </c:txPr>
+    </c:title>
+    <c:autoTitleDeleted val="0"/>
+    <c:plotArea>
+      <c:layout/>
+      <c:barChart>
+        <c:barDir val="col"/>
+        <c:grouping val="clustered"/>
+        <c:varyColors val="0"/>
+        <c:ser>
+          <c:idx val="0"/>
+          <c:order val="0"/>
+          <c:tx>
+            <c:v>Time</c:v>
+          </c:tx>
+          <c:spPr>
+            <a:pattFill prst="narHorz">
+              <a:fgClr>
+                <a:schemeClr val="accent1"/>
+              </a:fgClr>
+              <a:bgClr>
+                <a:schemeClr val="accent1">
+                  <a:lumMod val="20000"/>
+                  <a:lumOff val="80000"/>
+                </a:schemeClr>
+              </a:bgClr>
+            </a:pattFill>
+            <a:ln>
+              <a:noFill/>
+            </a:ln>
+            <a:effectLst>
+              <a:innerShdw blurRad="114300">
+                <a:schemeClr val="accent1"/>
+              </a:innerShdw>
+            </a:effectLst>
+          </c:spPr>
+          <c:invertIfNegative val="0"/>
+          <c:dPt>
+            <c:idx val="4"/>
+            <c:invertIfNegative val="0"/>
+            <c:bubble3D val="0"/>
+            <c:spPr>
+              <a:solidFill>
+                <a:srgbClr val="FF0000"/>
+              </a:solidFill>
+              <a:ln>
+                <a:noFill/>
+              </a:ln>
+              <a:effectLst>
+                <a:innerShdw blurRad="114300">
+                  <a:schemeClr val="accent1"/>
+                </a:innerShdw>
+              </a:effectLst>
+            </c:spPr>
+            <c:extLst>
+              <c:ext xmlns:c16="http://schemas.microsoft.com/office/drawing/2014/chart" uri="{C3380CC4-5D6E-409C-BE32-E72D297353CC}">
+                <c16:uniqueId val="{00000001-B64E-9442-9FAE-63F612AC36EA}"/>
+              </c:ext>
+            </c:extLst>
+          </c:dPt>
+          <c:dLbls>
+            <c:spPr>
+              <a:noFill/>
+              <a:ln>
+                <a:noFill/>
+              </a:ln>
+              <a:effectLst/>
+            </c:spPr>
+            <c:txPr>
+              <a:bodyPr rot="0" spcFirstLastPara="1" vertOverflow="ellipsis" vert="horz" wrap="square" lIns="38100" tIns="19050" rIns="38100" bIns="19050" anchor="ctr" anchorCtr="1">
+                <a:spAutoFit/>
+              </a:bodyPr>
+              <a:lstStyle/>
+              <a:p>
+                <a:pPr>
+                  <a:defRPr sz="900" b="0" i="0" u="none" strike="noStrike" kern="1200" baseline="0">
+                    <a:solidFill>
+                      <a:schemeClr val="tx1">
+                        <a:lumMod val="75000"/>
+                        <a:lumOff val="25000"/>
+                      </a:schemeClr>
+                    </a:solidFill>
+                    <a:latin typeface="+mn-lt"/>
+                    <a:ea typeface="+mn-ea"/>
+                    <a:cs typeface="+mn-cs"/>
+                  </a:defRPr>
+                </a:pPr>
+                <a:endParaRPr lang="en-US"/>
+              </a:p>
+            </c:txPr>
+            <c:dLblPos val="outEnd"/>
+            <c:showLegendKey val="0"/>
+            <c:showVal val="1"/>
+            <c:showCatName val="0"/>
+            <c:showSerName val="0"/>
+            <c:showPercent val="0"/>
+            <c:showBubbleSize val="0"/>
+            <c:showLeaderLines val="0"/>
+            <c:extLst>
+              <c:ext xmlns:c15="http://schemas.microsoft.com/office/drawing/2012/chart" uri="{CE6537A1-D6FC-4f65-9D91-7224C49458BB}">
+                <c15:showLeaderLines val="1"/>
+                <c15:leaderLines>
+                  <c:spPr>
+                    <a:ln w="9525">
+                      <a:solidFill>
+                        <a:schemeClr val="tx1">
+                          <a:lumMod val="35000"/>
+                          <a:lumOff val="65000"/>
+                        </a:schemeClr>
+                      </a:solidFill>
+                    </a:ln>
+                    <a:effectLst/>
+                  </c:spPr>
+                </c15:leaderLines>
+              </c:ext>
+            </c:extLst>
+          </c:dLbls>
+          <c:cat>
+            <c:numRef>
+              <c:f>Sheet1!$A$1:$A$7</c:f>
+              <c:numCache>
+                <c:formatCode>General</c:formatCode>
+                <c:ptCount val="7"/>
+                <c:pt idx="0">
+                  <c:v>16</c:v>
+                </c:pt>
+                <c:pt idx="1">
+                  <c:v>32</c:v>
+                </c:pt>
+                <c:pt idx="2">
+                  <c:v>64</c:v>
+                </c:pt>
+                <c:pt idx="3">
+                  <c:v>128</c:v>
+                </c:pt>
+                <c:pt idx="4">
+                  <c:v>256</c:v>
+                </c:pt>
+                <c:pt idx="5">
+                  <c:v>512</c:v>
+                </c:pt>
+                <c:pt idx="6">
+                  <c:v>1024</c:v>
+                </c:pt>
+              </c:numCache>
+            </c:numRef>
+          </c:cat>
+          <c:val>
+            <c:numRef>
+              <c:f>Sheet1!$B$1:$B$7</c:f>
+              <c:numCache>
+                <c:formatCode>General</c:formatCode>
+                <c:ptCount val="7"/>
+                <c:pt idx="0">
+                  <c:v>30.29</c:v>
+                </c:pt>
+                <c:pt idx="1">
+                  <c:v>27.655000000000001</c:v>
+                </c:pt>
+                <c:pt idx="2">
+                  <c:v>26.079000000000001</c:v>
+                </c:pt>
+                <c:pt idx="3">
+                  <c:v>25.984000000000002</c:v>
+                </c:pt>
+                <c:pt idx="4">
+                  <c:v>24.954000000000001</c:v>
+                </c:pt>
+                <c:pt idx="5">
+                  <c:v>25.047000000000001</c:v>
+                </c:pt>
+                <c:pt idx="6">
+                  <c:v>25.26</c:v>
+                </c:pt>
+              </c:numCache>
+            </c:numRef>
+          </c:val>
+          <c:extLst>
+            <c:ext xmlns:c16="http://schemas.microsoft.com/office/drawing/2014/chart" uri="{C3380CC4-5D6E-409C-BE32-E72D297353CC}">
+              <c16:uniqueId val="{00000002-B64E-9442-9FAE-63F612AC36EA}"/>
+            </c:ext>
+          </c:extLst>
+        </c:ser>
+        <c:dLbls>
+          <c:dLblPos val="outEnd"/>
+          <c:showLegendKey val="0"/>
+          <c:showVal val="1"/>
+          <c:showCatName val="0"/>
+          <c:showSerName val="0"/>
+          <c:showPercent val="0"/>
+          <c:showBubbleSize val="0"/>
+        </c:dLbls>
+        <c:gapWidth val="164"/>
+        <c:overlap val="-22"/>
+        <c:axId val="1166084528"/>
+        <c:axId val="1166435536"/>
+      </c:barChart>
+      <c:catAx>
+        <c:axId val="1166084528"/>
+        <c:scaling>
+          <c:orientation val="minMax"/>
+        </c:scaling>
+        <c:delete val="0"/>
+        <c:axPos val="b"/>
+        <c:title>
+          <c:tx>
+            <c:rich>
+              <a:bodyPr rot="0" spcFirstLastPara="1" vertOverflow="ellipsis" vert="horz" wrap="square" anchor="ctr" anchorCtr="1"/>
+              <a:lstStyle/>
+              <a:p>
+                <a:pPr>
+                  <a:defRPr sz="900" b="1" i="0" u="none" strike="noStrike" kern="1200" baseline="0">
+                    <a:solidFill>
+                      <a:schemeClr val="tx1">
+                        <a:lumMod val="65000"/>
+                        <a:lumOff val="35000"/>
+                      </a:schemeClr>
+                    </a:solidFill>
+                    <a:latin typeface="+mn-lt"/>
+                    <a:ea typeface="+mn-ea"/>
+                    <a:cs typeface="+mn-cs"/>
+                  </a:defRPr>
+                </a:pPr>
+                <a:r>
+                  <a:rPr lang="en-US"/>
+                  <a:t>Block Size</a:t>
+                </a:r>
+              </a:p>
+            </c:rich>
+          </c:tx>
+          <c:overlay val="0"/>
+          <c:spPr>
+            <a:noFill/>
+            <a:ln>
+              <a:noFill/>
+            </a:ln>
+            <a:effectLst/>
+          </c:spPr>
+          <c:txPr>
+            <a:bodyPr rot="0" spcFirstLastPara="1" vertOverflow="ellipsis" vert="horz" wrap="square" anchor="ctr" anchorCtr="1"/>
+            <a:lstStyle/>
+            <a:p>
+              <a:pPr>
+                <a:defRPr sz="900" b="1" i="0" u="none" strike="noStrike" kern="1200" baseline="0">
+                  <a:solidFill>
+                    <a:schemeClr val="tx1">
+                      <a:lumMod val="65000"/>
+                      <a:lumOff val="35000"/>
+                    </a:schemeClr>
+                  </a:solidFill>
+                  <a:latin typeface="+mn-lt"/>
+                  <a:ea typeface="+mn-ea"/>
+                  <a:cs typeface="+mn-cs"/>
+                </a:defRPr>
+              </a:pPr>
+              <a:endParaRPr lang="en-US"/>
+            </a:p>
+          </c:txPr>
+        </c:title>
+        <c:numFmt formatCode="General" sourceLinked="1"/>
+        <c:majorTickMark val="none"/>
+        <c:minorTickMark val="none"/>
+        <c:tickLblPos val="nextTo"/>
+        <c:spPr>
+          <a:noFill/>
+          <a:ln w="19050" cap="flat" cmpd="sng" algn="ctr">
+            <a:solidFill>
+              <a:schemeClr val="tx1">
+                <a:lumMod val="25000"/>
+                <a:lumOff val="75000"/>
+              </a:schemeClr>
+            </a:solidFill>
+            <a:round/>
+          </a:ln>
+          <a:effectLst/>
+        </c:spPr>
+        <c:txPr>
+          <a:bodyPr rot="-60000000" spcFirstLastPara="1" vertOverflow="ellipsis" vert="horz" wrap="square" anchor="ctr" anchorCtr="1"/>
+          <a:lstStyle/>
+          <a:p>
+            <a:pPr>
+              <a:defRPr sz="900" b="0" i="0" u="none" strike="noStrike" kern="1200" baseline="0">
+                <a:solidFill>
+                  <a:schemeClr val="tx1">
+                    <a:lumMod val="65000"/>
+                    <a:lumOff val="35000"/>
+                  </a:schemeClr>
+                </a:solidFill>
+                <a:latin typeface="+mn-lt"/>
+                <a:ea typeface="+mn-ea"/>
+                <a:cs typeface="+mn-cs"/>
+              </a:defRPr>
+            </a:pPr>
+            <a:endParaRPr lang="en-US"/>
+          </a:p>
+        </c:txPr>
+        <c:crossAx val="1166435536"/>
+        <c:crosses val="autoZero"/>
+        <c:auto val="1"/>
+        <c:lblAlgn val="ctr"/>
+        <c:lblOffset val="100"/>
+        <c:noMultiLvlLbl val="0"/>
+      </c:catAx>
+      <c:valAx>
+        <c:axId val="1166435536"/>
+        <c:scaling>
+          <c:orientation val="minMax"/>
+        </c:scaling>
+        <c:delete val="0"/>
+        <c:axPos val="l"/>
+        <c:title>
+          <c:tx>
+            <c:rich>
+              <a:bodyPr rot="-5400000" spcFirstLastPara="1" vertOverflow="ellipsis" vert="horz" wrap="square" anchor="ctr" anchorCtr="1"/>
+              <a:lstStyle/>
+              <a:p>
+                <a:pPr>
+                  <a:defRPr sz="900" b="1" i="0" u="none" strike="noStrike" kern="1200" baseline="0">
+                    <a:solidFill>
+                      <a:schemeClr val="tx1">
+                        <a:lumMod val="65000"/>
+                        <a:lumOff val="35000"/>
+                      </a:schemeClr>
+                    </a:solidFill>
+                    <a:latin typeface="+mn-lt"/>
+                    <a:ea typeface="+mn-ea"/>
+                    <a:cs typeface="+mn-cs"/>
+                  </a:defRPr>
+                </a:pPr>
+                <a:r>
+                  <a:rPr lang="en-US"/>
+                  <a:t>seconds</a:t>
+                </a:r>
+              </a:p>
+            </c:rich>
+          </c:tx>
+          <c:overlay val="0"/>
+          <c:spPr>
+            <a:noFill/>
+            <a:ln>
+              <a:noFill/>
+            </a:ln>
+            <a:effectLst/>
+          </c:spPr>
+          <c:txPr>
+            <a:bodyPr rot="-5400000" spcFirstLastPara="1" vertOverflow="ellipsis" vert="horz" wrap="square" anchor="ctr" anchorCtr="1"/>
+            <a:lstStyle/>
+            <a:p>
+              <a:pPr>
+                <a:defRPr sz="900" b="1" i="0" u="none" strike="noStrike" kern="1200" baseline="0">
+                  <a:solidFill>
+                    <a:schemeClr val="tx1">
+                      <a:lumMod val="65000"/>
+                      <a:lumOff val="35000"/>
+                    </a:schemeClr>
+                  </a:solidFill>
+                  <a:latin typeface="+mn-lt"/>
+                  <a:ea typeface="+mn-ea"/>
+                  <a:cs typeface="+mn-cs"/>
+                </a:defRPr>
+              </a:pPr>
+              <a:endParaRPr lang="en-US"/>
+            </a:p>
+          </c:txPr>
+        </c:title>
+        <c:numFmt formatCode="General" sourceLinked="1"/>
+        <c:majorTickMark val="none"/>
+        <c:minorTickMark val="none"/>
+        <c:tickLblPos val="nextTo"/>
+        <c:spPr>
+          <a:noFill/>
+          <a:ln>
+            <a:noFill/>
+          </a:ln>
+          <a:effectLst/>
+        </c:spPr>
+        <c:txPr>
+          <a:bodyPr rot="-60000000" spcFirstLastPara="1" vertOverflow="ellipsis" vert="horz" wrap="square" anchor="ctr" anchorCtr="1"/>
+          <a:lstStyle/>
+          <a:p>
+            <a:pPr>
+              <a:defRPr sz="900" b="0" i="0" u="none" strike="noStrike" kern="1200" baseline="0">
+                <a:solidFill>
+                  <a:schemeClr val="tx1">
+                    <a:lumMod val="65000"/>
+                    <a:lumOff val="35000"/>
+                  </a:schemeClr>
+                </a:solidFill>
+                <a:latin typeface="+mn-lt"/>
+                <a:ea typeface="+mn-ea"/>
+                <a:cs typeface="+mn-cs"/>
+              </a:defRPr>
+            </a:pPr>
+            <a:endParaRPr lang="en-US"/>
+          </a:p>
+        </c:txPr>
+        <c:crossAx val="1166084528"/>
+        <c:crosses val="autoZero"/>
+        <c:crossBetween val="between"/>
+      </c:valAx>
+      <c:spPr>
+        <a:noFill/>
+        <a:ln>
+          <a:noFill/>
+        </a:ln>
+        <a:effectLst/>
+      </c:spPr>
+    </c:plotArea>
+    <c:plotVisOnly val="1"/>
+    <c:dispBlanksAs val="gap"/>
+    <c:showDLblsOverMax val="0"/>
+    <c:extLst>
+      <c:ext xmlns:c16r3="http://schemas.microsoft.com/office/drawing/2017/03/chart" uri="{56B9EC1D-385E-4148-901F-78D8002777C0}">
+        <c16r3:dataDisplayOptions16>
+          <c16r3:dispNaAsBlank val="1"/>
+        </c16r3:dataDisplayOptions16>
+      </c:ext>
+    </c:extLst>
+  </c:chart>
+  <c:spPr>
+    <a:solidFill>
+      <a:schemeClr val="bg1"/>
+    </a:solidFill>
+    <a:ln w="9525" cap="flat" cmpd="sng" algn="ctr">
+      <a:solidFill>
+        <a:schemeClr val="tx1">
+          <a:lumMod val="15000"/>
+          <a:lumOff val="85000"/>
+        </a:schemeClr>
+      </a:solidFill>
+      <a:round/>
+    </a:ln>
+    <a:effectLst/>
+  </c:spPr>
+  <c:txPr>
+    <a:bodyPr/>
+    <a:lstStyle/>
+    <a:p>
+      <a:pPr>
+        <a:defRPr/>
+      </a:pPr>
+      <a:endParaRPr lang="en-US"/>
+    </a:p>
+  </c:txPr>
+  <c:externalData r:id="rId3">
+    <c:autoUpdate val="0"/>
+  </c:externalData>
+</c:chartSpace>
+</file>
+
+<file path=word/charts/colors1.xml><?xml version="1.0" encoding="utf-8"?>
+<cs:colorStyle xmlns:cs="http://schemas.microsoft.com/office/drawing/2012/chartStyle" xmlns:a="http://schemas.openxmlformats.org/drawingml/2006/main" meth="cycle" id="10">
+  <a:schemeClr val="accent1"/>
+  <a:schemeClr val="accent2"/>
+  <a:schemeClr val="accent3"/>
+  <a:schemeClr val="accent4"/>
+  <a:schemeClr val="accent5"/>
+  <a:schemeClr val="accent6"/>
+  <cs:variation/>
+  <cs:variation>
+    <a:lumMod val="60000"/>
+  </cs:variation>
+  <cs:variation>
+    <a:lumMod val="80000"/>
+    <a:lumOff val="20000"/>
+  </cs:variation>
+  <cs:variation>
+    <a:lumMod val="80000"/>
+  </cs:variation>
+  <cs:variation>
+    <a:lumMod val="60000"/>
+    <a:lumOff val="40000"/>
+  </cs:variation>
+  <cs:variation>
+    <a:lumMod val="50000"/>
+  </cs:variation>
+  <cs:variation>
+    <a:lumMod val="70000"/>
+    <a:lumOff val="30000"/>
+  </cs:variation>
+  <cs:variation>
+    <a:lumMod val="70000"/>
+  </cs:variation>
+  <cs:variation>
+    <a:lumMod val="50000"/>
+    <a:lumOff val="50000"/>
+  </cs:variation>
+</cs:colorStyle>
+</file>
+
+<file path=word/charts/style1.xml><?xml version="1.0" encoding="utf-8"?>
+<cs:chartStyle xmlns:cs="http://schemas.microsoft.com/office/drawing/2012/chartStyle" xmlns:a="http://schemas.openxmlformats.org/drawingml/2006/main" id="203">
+  <cs:axisTitle>
+    <cs:lnRef idx="0"/>
+    <cs:fillRef idx="0"/>
+    <cs:effectRef idx="0"/>
+    <cs:fontRef idx="minor">
+      <a:schemeClr val="tx1">
+        <a:lumMod val="65000"/>
+        <a:lumOff val="35000"/>
+      </a:schemeClr>
+    </cs:fontRef>
+    <cs:defRPr sz="900" b="1" kern="1200"/>
+  </cs:axisTitle>
+  <cs:categoryAxis>
+    <cs:lnRef idx="0"/>
+    <cs:fillRef idx="0"/>
+    <cs:effectRef idx="0"/>
+    <cs:fontRef idx="minor">
+      <a:schemeClr val="tx1">
+        <a:lumMod val="65000"/>
+        <a:lumOff val="35000"/>
+      </a:schemeClr>
+    </cs:fontRef>
+    <cs:spPr>
+      <a:ln w="19050" cap="flat" cmpd="sng" algn="ctr">
+        <a:solidFill>
+          <a:schemeClr val="tx1">
+            <a:lumMod val="25000"/>
+            <a:lumOff val="75000"/>
+          </a:schemeClr>
+        </a:solidFill>
+        <a:round/>
+      </a:ln>
+    </cs:spPr>
+    <cs:defRPr sz="900" kern="1200"/>
+  </cs:categoryAxis>
+  <cs:chartArea mods="allowNoFillOverride allowNoLineOverride">
+    <cs:lnRef idx="0"/>
+    <cs:fillRef idx="0"/>
+    <cs:effectRef idx="0"/>
+    <cs:fontRef idx="minor">
+      <a:schemeClr val="dk1"/>
+    </cs:fontRef>
+    <cs:spPr>
+      <a:solidFill>
+        <a:schemeClr val="bg1"/>
+      </a:solidFill>
+      <a:ln w="9525" cap="flat" cmpd="sng" algn="ctr">
+        <a:solidFill>
+          <a:schemeClr val="tx1">
+            <a:lumMod val="15000"/>
+            <a:lumOff val="85000"/>
+          </a:schemeClr>
+        </a:solidFill>
+        <a:round/>
+      </a:ln>
+    </cs:spPr>
+    <cs:defRPr sz="900" kern="1200"/>
+  </cs:chartArea>
+  <cs:dataLabel>
+    <cs:lnRef idx="0"/>
+    <cs:fillRef idx="0"/>
+    <cs:effectRef idx="0"/>
+    <cs:fontRef idx="minor">
+      <a:schemeClr val="tx1">
+        <a:lumMod val="75000"/>
+        <a:lumOff val="25000"/>
+      </a:schemeClr>
+    </cs:fontRef>
+    <cs:defRPr sz="900" kern="1200"/>
+  </cs:dataLabel>
+  <cs:dataLabelCallout>
+    <cs:lnRef idx="0"/>
+    <cs:fillRef idx="0"/>
+    <cs:effectRef idx="0"/>
+    <cs:fontRef idx="minor">
+      <a:schemeClr val="dk1">
+        <a:lumMod val="65000"/>
+        <a:lumOff val="35000"/>
+      </a:schemeClr>
+    </cs:fontRef>
+    <cs:spPr>
+      <a:solidFill>
+        <a:schemeClr val="lt1"/>
+      </a:solidFill>
+      <a:ln>
+        <a:solidFill>
+          <a:schemeClr val="dk1">
+            <a:lumMod val="25000"/>
+            <a:lumOff val="75000"/>
+          </a:schemeClr>
+        </a:solidFill>
+      </a:ln>
+    </cs:spPr>
+    <cs:defRPr sz="900" kern="1200"/>
+    <cs:bodyPr rot="0" spcFirstLastPara="1" vertOverflow="clip" horzOverflow="clip" vert="horz" wrap="square" lIns="36576" tIns="18288" rIns="36576" bIns="18288" anchor="ctr" anchorCtr="1">
+      <a:spAutoFit/>
+    </cs:bodyPr>
+  </cs:dataLabelCallout>
+  <cs:dataPoint>
+    <cs:lnRef idx="0"/>
+    <cs:fillRef idx="0">
+      <cs:styleClr val="auto"/>
+    </cs:fillRef>
+    <cs:effectRef idx="0">
+      <cs:styleClr val="auto"/>
+    </cs:effectRef>
+    <cs:fontRef idx="minor">
+      <a:schemeClr val="dk1"/>
+    </cs:fontRef>
+    <cs:spPr>
+      <a:pattFill prst="narHorz">
+        <a:fgClr>
+          <a:schemeClr val="phClr"/>
+        </a:fgClr>
+        <a:bgClr>
+          <a:schemeClr val="phClr">
+            <a:lumMod val="20000"/>
+            <a:lumOff val="80000"/>
+          </a:schemeClr>
+        </a:bgClr>
+      </a:pattFill>
+      <a:effectLst>
+        <a:innerShdw blurRad="114300">
+          <a:schemeClr val="phClr"/>
+        </a:innerShdw>
+      </a:effectLst>
+    </cs:spPr>
+  </cs:dataPoint>
+  <cs:dataPoint3D>
+    <cs:lnRef idx="0"/>
+    <cs:fillRef idx="0">
+      <cs:styleClr val="auto"/>
+    </cs:fillRef>
+    <cs:effectRef idx="0"/>
+    <cs:fontRef idx="minor">
+      <a:schemeClr val="dk1"/>
+    </cs:fontRef>
+    <cs:spPr>
+      <a:pattFill prst="narHorz">
+        <a:fgClr>
+          <a:schemeClr val="phClr"/>
+        </a:fgClr>
+        <a:bgClr>
+          <a:schemeClr val="phClr">
+            <a:lumMod val="20000"/>
+            <a:lumOff val="80000"/>
+          </a:schemeClr>
+        </a:bgClr>
+      </a:pattFill>
+      <a:effectLst>
+        <a:innerShdw blurRad="114300">
+          <a:schemeClr val="phClr"/>
+        </a:innerShdw>
+      </a:effectLst>
+    </cs:spPr>
+  </cs:dataPoint3D>
+  <cs:dataPointLine>
+    <cs:lnRef idx="0">
+      <cs:styleClr val="auto"/>
+    </cs:lnRef>
+    <cs:fillRef idx="0"/>
+    <cs:effectRef idx="0"/>
+    <cs:fontRef idx="minor">
+      <a:schemeClr val="dk1"/>
+    </cs:fontRef>
+    <cs:spPr>
+      <a:ln w="28575" cap="rnd">
+        <a:solidFill>
+          <a:schemeClr val="phClr"/>
+        </a:solidFill>
+        <a:round/>
+      </a:ln>
+    </cs:spPr>
+  </cs:dataPointLine>
+  <cs:dataPointMarker>
+    <cs:lnRef idx="0"/>
+    <cs:fillRef idx="0">
+      <cs:styleClr val="auto"/>
+    </cs:fillRef>
+    <cs:effectRef idx="0"/>
+    <cs:fontRef idx="minor">
+      <a:schemeClr val="dk1"/>
+    </cs:fontRef>
+    <cs:spPr>
+      <a:solidFill>
+        <a:schemeClr val="phClr"/>
+      </a:solidFill>
+    </cs:spPr>
+  </cs:dataPointMarker>
+  <cs:dataPointMarkerLayout symbol="circle" size="6"/>
+  <cs:dataPointWireframe>
+    <cs:lnRef idx="0">
+      <cs:styleClr val="auto"/>
+    </cs:lnRef>
+    <cs:fillRef idx="0"/>
+    <cs:effectRef idx="0"/>
+    <cs:fontRef idx="minor">
+      <a:schemeClr val="dk1"/>
+    </cs:fontRef>
+    <cs:spPr>
+      <a:ln w="9525" cap="rnd">
+        <a:solidFill>
+          <a:schemeClr val="phClr"/>
+        </a:solidFill>
+        <a:round/>
+      </a:ln>
+    </cs:spPr>
+  </cs:dataPointWireframe>
+  <cs:dataTable>
+    <cs:lnRef idx="0"/>
+    <cs:fillRef idx="0"/>
+    <cs:effectRef idx="0"/>
+    <cs:fontRef idx="minor">
+      <a:schemeClr val="tx1">
+        <a:lumMod val="65000"/>
+        <a:lumOff val="35000"/>
+      </a:schemeClr>
+    </cs:fontRef>
+    <cs:spPr>
+      <a:ln w="9525">
+        <a:solidFill>
+          <a:schemeClr val="tx1">
+            <a:lumMod val="15000"/>
+            <a:lumOff val="85000"/>
+          </a:schemeClr>
+        </a:solidFill>
+      </a:ln>
+    </cs:spPr>
+    <cs:defRPr sz="900" kern="1200"/>
+  </cs:dataTable>
+  <cs:downBar>
+    <cs:lnRef idx="0"/>
+    <cs:fillRef idx="0"/>
+    <cs:effectRef idx="0"/>
+    <cs:fontRef idx="minor">
+      <a:schemeClr val="dk1"/>
+    </cs:fontRef>
+    <cs:spPr>
+      <a:solidFill>
+        <a:schemeClr val="dk1">
+          <a:lumMod val="75000"/>
+          <a:lumOff val="25000"/>
+        </a:schemeClr>
+      </a:solidFill>
+      <a:ln w="9525">
+        <a:solidFill>
+          <a:schemeClr val="tx1">
+            <a:lumMod val="50000"/>
+            <a:lumOff val="50000"/>
+          </a:schemeClr>
+        </a:solidFill>
+      </a:ln>
+    </cs:spPr>
+  </cs:downBar>
+  <cs:dropLine>
+    <cs:lnRef idx="0"/>
+    <cs:fillRef idx="0"/>
+    <cs:effectRef idx="0"/>
+    <cs:fontRef idx="minor">
+      <a:schemeClr val="dk1"/>
+    </cs:fontRef>
+    <cs:spPr>
+      <a:ln w="9525">
+        <a:solidFill>
+          <a:schemeClr val="tx1">
+            <a:lumMod val="35000"/>
+            <a:lumOff val="65000"/>
+          </a:schemeClr>
+        </a:solidFill>
+        <a:round/>
+      </a:ln>
+    </cs:spPr>
+  </cs:dropLine>
+  <cs:errorBar>
+    <cs:lnRef idx="0"/>
+    <cs:fillRef idx="0"/>
+    <cs:effectRef idx="0"/>
+    <cs:fontRef idx="minor">
+      <a:schemeClr val="dk1"/>
+    </cs:fontRef>
+    <cs:spPr>
+      <a:ln w="9525">
+        <a:solidFill>
+          <a:schemeClr val="tx1">
+            <a:lumMod val="50000"/>
+            <a:lumOff val="50000"/>
+          </a:schemeClr>
+        </a:solidFill>
+        <a:round/>
+      </a:ln>
+    </cs:spPr>
+  </cs:errorBar>
+  <cs:floor>
+    <cs:lnRef idx="0"/>
+    <cs:fillRef idx="0"/>
+    <cs:effectRef idx="0"/>
+    <cs:fontRef idx="minor">
+      <a:schemeClr val="dk1"/>
+    </cs:fontRef>
+  </cs:floor>
+  <cs:gridlineMajor>
+    <cs:lnRef idx="0"/>
+    <cs:fillRef idx="0"/>
+    <cs:effectRef idx="0"/>
+    <cs:fontRef idx="minor">
+      <a:schemeClr val="dk1"/>
+    </cs:fontRef>
+    <cs:spPr>
+      <a:ln>
+        <a:solidFill>
+          <a:schemeClr val="tx1">
+            <a:lumMod val="15000"/>
+            <a:lumOff val="85000"/>
+          </a:schemeClr>
+        </a:solidFill>
+      </a:ln>
+    </cs:spPr>
+  </cs:gridlineMajor>
+  <cs:gridlineMinor>
+    <cs:lnRef idx="0"/>
+    <cs:fillRef idx="0"/>
+    <cs:effectRef idx="0"/>
+    <cs:fontRef idx="minor">
+      <a:schemeClr val="dk1"/>
+    </cs:fontRef>
+    <cs:spPr>
+      <a:ln>
+        <a:solidFill>
+          <a:schemeClr val="tx1">
+            <a:lumMod val="5000"/>
+            <a:lumOff val="95000"/>
+          </a:schemeClr>
+        </a:solidFill>
+      </a:ln>
+    </cs:spPr>
+  </cs:gridlineMinor>
+  <cs:hiLoLine>
+    <cs:lnRef idx="0"/>
+    <cs:fillRef idx="0"/>
+    <cs:effectRef idx="0"/>
+    <cs:fontRef idx="minor">
+      <a:schemeClr val="dk1"/>
+    </cs:fontRef>
+    <cs:spPr>
+      <a:ln w="9525">
+        <a:solidFill>
+          <a:schemeClr val="tx1">
+            <a:lumMod val="35000"/>
+            <a:lumOff val="65000"/>
+          </a:schemeClr>
+        </a:solidFill>
+        <a:round/>
+      </a:ln>
+    </cs:spPr>
+  </cs:hiLoLine>
+  <cs:leaderLine>
+    <cs:lnRef idx="0"/>
+    <cs:fillRef idx="0"/>
+    <cs:effectRef idx="0"/>
+    <cs:fontRef idx="minor">
+      <a:schemeClr val="dk1"/>
+    </cs:fontRef>
+    <cs:spPr>
+      <a:ln w="9525">
+        <a:solidFill>
+          <a:schemeClr val="tx1">
+            <a:lumMod val="35000"/>
+            <a:lumOff val="65000"/>
+          </a:schemeClr>
+        </a:solidFill>
+      </a:ln>
+    </cs:spPr>
+  </cs:leaderLine>
+  <cs:legend>
+    <cs:lnRef idx="0"/>
+    <cs:fillRef idx="0"/>
+    <cs:effectRef idx="0"/>
+    <cs:fontRef idx="minor">
+      <a:schemeClr val="tx1">
+        <a:lumMod val="65000"/>
+        <a:lumOff val="35000"/>
+      </a:schemeClr>
+    </cs:fontRef>
+    <cs:defRPr sz="900" kern="1200"/>
+  </cs:legend>
+  <cs:plotArea mods="allowNoFillOverride allowNoLineOverride">
+    <cs:lnRef idx="0"/>
+    <cs:fillRef idx="0"/>
+    <cs:effectRef idx="0"/>
+    <cs:fontRef idx="minor">
+      <a:schemeClr val="dk1"/>
+    </cs:fontRef>
+  </cs:plotArea>
+  <cs:plotArea3D mods="allowNoFillOverride allowNoLineOverride">
+    <cs:lnRef idx="0"/>
+    <cs:fillRef idx="0"/>
+    <cs:effectRef idx="0"/>
+    <cs:fontRef idx="minor">
+      <a:schemeClr val="dk1"/>
+    </cs:fontRef>
+  </cs:plotArea3D>
+  <cs:seriesAxis>
+    <cs:lnRef idx="0"/>
+    <cs:fillRef idx="0"/>
+    <cs:effectRef idx="0"/>
+    <cs:fontRef idx="minor">
+      <a:schemeClr val="tx1">
+        <a:lumMod val="65000"/>
+        <a:lumOff val="35000"/>
+      </a:schemeClr>
+    </cs:fontRef>
+    <cs:defRPr sz="900" kern="1200"/>
+  </cs:seriesAxis>
+  <cs:seriesLine>
+    <cs:lnRef idx="0"/>
+    <cs:fillRef idx="0"/>
+    <cs:effectRef idx="0"/>
+    <cs:fontRef idx="minor">
+      <a:schemeClr val="dk1"/>
+    </cs:fontRef>
+    <cs:spPr>
+      <a:ln w="9525">
+        <a:solidFill>
+          <a:schemeClr val="tx1">
+            <a:lumMod val="35000"/>
+            <a:lumOff val="65000"/>
+          </a:schemeClr>
+        </a:solidFill>
+        <a:round/>
+      </a:ln>
+    </cs:spPr>
+  </cs:seriesLine>
+  <cs:title>
+    <cs:lnRef idx="0"/>
+    <cs:fillRef idx="0"/>
+    <cs:effectRef idx="0"/>
+    <cs:fontRef idx="minor">
+      <a:schemeClr val="tx1">
+        <a:lumMod val="50000"/>
+        <a:lumOff val="50000"/>
+      </a:schemeClr>
+    </cs:fontRef>
+    <cs:defRPr sz="1800" b="1" kern="1200" cap="all" spc="150" baseline="0"/>
+  </cs:title>
+  <cs:trendline>
+    <cs:lnRef idx="0">
+      <cs:styleClr val="auto"/>
+    </cs:lnRef>
+    <cs:fillRef idx="0"/>
+    <cs:effectRef idx="0"/>
+    <cs:fontRef idx="minor">
+      <a:schemeClr val="dk1"/>
+    </cs:fontRef>
+    <cs:spPr>
+      <a:ln w="19050" cap="rnd">
+        <a:solidFill>
+          <a:schemeClr val="phClr"/>
+        </a:solidFill>
+      </a:ln>
+    </cs:spPr>
+  </cs:trendline>
+  <cs:trendlineLabel>
+    <cs:lnRef idx="0"/>
+    <cs:fillRef idx="0"/>
+    <cs:effectRef idx="0"/>
+    <cs:fontRef idx="minor">
+      <a:schemeClr val="tx1">
+        <a:lumMod val="65000"/>
+        <a:lumOff val="35000"/>
+      </a:schemeClr>
+    </cs:fontRef>
+    <cs:defRPr sz="900" kern="1200"/>
+  </cs:trendlineLabel>
+  <cs:upBar>
+    <cs:lnRef idx="0"/>
+    <cs:fillRef idx="0"/>
+    <cs:effectRef idx="0"/>
+    <cs:fontRef idx="minor">
+      <a:schemeClr val="dk1"/>
+    </cs:fontRef>
+    <cs:spPr>
+      <a:solidFill>
+        <a:schemeClr val="lt1"/>
+      </a:solidFill>
+      <a:ln w="9525">
+        <a:solidFill>
+          <a:schemeClr val="tx1">
+            <a:lumMod val="50000"/>
+            <a:lumOff val="50000"/>
+          </a:schemeClr>
+        </a:solidFill>
+      </a:ln>
+    </cs:spPr>
+  </cs:upBar>
+  <cs:valueAxis>
+    <cs:lnRef idx="0"/>
+    <cs:fillRef idx="0"/>
+    <cs:effectRef idx="0"/>
+    <cs:fontRef idx="minor">
+      <a:schemeClr val="tx1">
+        <a:lumMod val="65000"/>
+        <a:lumOff val="35000"/>
+      </a:schemeClr>
+    </cs:fontRef>
+    <cs:defRPr sz="900" kern="1200"/>
+  </cs:valueAxis>
+  <cs:wall>
+    <cs:lnRef idx="0"/>
+    <cs:fillRef idx="0"/>
+    <cs:effectRef idx="0"/>
+    <cs:fontRef idx="minor">
+      <a:schemeClr val="dk1"/>
+    </cs:fontRef>
+  </cs:wall>
+</cs:chartStyle>
 </file>
 
 <file path=word/theme/theme1.xml><?xml version="1.0" encoding="utf-8"?>
@@ -1255,4 +5780,74 @@
     </a:ext>
   </a:extLst>
 </a:theme>
+</file>
+
+<file path=customXml/item1.xml><?xml version="1.0" encoding="utf-8"?>
+<b:Sources xmlns:b="http://schemas.openxmlformats.org/officeDocument/2006/bibliography" xmlns="http://schemas.openxmlformats.org/officeDocument/2006/bibliography" SelectedStyle="/IEEE2006OfficeOnline.xsl" StyleName="IEEE" Version="2006">
+  <b:Source>
+    <b:Tag>ARM</b:Tag>
+    <b:SourceType>InternetSite</b:SourceType>
+    <b:Guid>{D235077C-2A79-4646-9746-2BA35F5520F3}</b:Guid>
+    <b:Author>
+      <b:Author>
+        <b:Corporate>ARM</b:Corporate>
+      </b:Author>
+    </b:Author>
+    <b:Title>Getting Started with Neon Intrinsics on Android</b:Title>
+    <b:URL>https://www.arm.com/technologies/neon</b:URL>
+    <b:RefOrder>2</b:RefOrder>
+  </b:Source>
+  <b:Source>
+    <b:Tag>Vic</b:Tag>
+    <b:SourceType>InternetSite</b:SourceType>
+    <b:Guid>{0692C583-791D-9F49-AEFD-47333EFB9119}</b:Guid>
+    <b:Author>
+      <b:Author>
+        <b:NameList>
+          <b:Person>
+            <b:Last>Blanco</b:Last>
+            <b:First>Victor</b:First>
+          </b:Person>
+        </b:NameList>
+      </b:Author>
+    </b:Author>
+    <b:Title>Intro to Practical SIMD for Graphics</b:Title>
+    <b:URL>https://vkguide.dev/docs/extra-chapter/intro_to_simd/</b:URL>
+    <b:RefOrder>1</b:RefOrder>
+  </b:Source>
+  <b:Source>
+    <b:Tag>ARM1</b:Tag>
+    <b:SourceType>InternetSite</b:SourceType>
+    <b:Guid>{8A6C7972-8BF6-9442-9786-F09BB8730B8A}</b:Guid>
+    <b:Author>
+      <b:Author>
+        <b:Corporate>ARM</b:Corporate>
+      </b:Author>
+    </b:Author>
+    <b:Title>Intrinsics</b:Title>
+    <b:URL>https://developer.arm.com/architectures/instruction-sets/intrinsics/#f:@navigationhierarchiessimdisa=[Neon]&amp;q=vaddvq_s32</b:URL>
+    <b:RefOrder>3</b:RefOrder>
+  </b:Source>
+  <b:Source>
+    <b:Tag>Mic</b:Tag>
+    <b:SourceType>InternetSite</b:SourceType>
+    <b:Guid>{D14ECDF4-F324-C847-B902-2CF8E5F3E750}</b:Guid>
+    <b:Author>
+      <b:Author>
+        <b:Corporate>Microsoft</b:Corporate>
+      </b:Author>
+    </b:Author>
+    <b:Title>ARM intrinsics</b:Title>
+    <b:URL>https://learn.microsoft.com/en-us/cpp/intrinsics/arm-intrinsics?view=msvc-170</b:URL>
+    <b:RefOrder>4</b:RefOrder>
+  </b:Source>
+</b:Sources>
+</file>
+
+<file path=customXml/itemProps1.xml><?xml version="1.0" encoding="utf-8"?>
+<ds:datastoreItem xmlns:ds="http://schemas.openxmlformats.org/officeDocument/2006/customXml" ds:itemID="{71428B3E-F467-CC49-9CF8-1F9C8F064036}">
+  <ds:schemaRefs>
+    <ds:schemaRef ds:uri="http://schemas.openxmlformats.org/officeDocument/2006/bibliography"/>
+  </ds:schemaRefs>
+</ds:datastoreItem>
 </file>
</xml_diff>